<commit_message>
Started Understanding Operator Overloading
</commit_message>
<xml_diff>
--- a/OOD Lab/Lab_1/OODS-EE Lab_01 Classes, Constructors & Relationship.docx
+++ b/OOD Lab/Lab_1/OODS-EE Lab_01 Classes, Constructors & Relationship.docx
@@ -1,6 +1,6 @@
 
 <file path=word/document.xml><?xml version="1.0" encoding="utf-8"?>
-<w:document xmlns:wpc="http://schemas.microsoft.com/office/word/2010/wordprocessingCanvas" xmlns:cx="http://schemas.microsoft.com/office/drawing/2014/chartex" xmlns:cx1="http://schemas.microsoft.com/office/drawing/2015/9/8/chartex" xmlns:cx2="http://schemas.microsoft.com/office/drawing/2015/10/21/chartex" xmlns:cx3="http://schemas.microsoft.com/office/drawing/2016/5/9/chartex" xmlns:cx4="http://schemas.microsoft.com/office/drawing/2016/5/10/chartex" xmlns:cx5="http://schemas.microsoft.com/office/drawing/2016/5/11/chartex" xmlns:cx6="http://schemas.microsoft.com/office/drawing/2016/5/12/chartex" xmlns:cx7="http://schemas.microsoft.com/office/drawing/2016/5/13/chartex" xmlns:cx8="http://schemas.microsoft.com/office/drawing/2016/5/14/chartex" xmlns:mc="http://schemas.openxmlformats.org/markup-compatibility/2006" xmlns:aink="http://schemas.microsoft.com/office/drawing/2016/ink" xmlns:am3d="http://schemas.microsoft.com/office/drawing/2017/model3d" xmlns:o="urn:schemas-microsoft-com:office:office" xmlns:oel="http://schemas.microsoft.com/office/2019/extlst" xmlns:r="http://schemas.openxmlformats.org/officeDocument/2006/relationships" xmlns:m="http://schemas.openxmlformats.org/officeDocument/2006/math" xmlns:v="urn:schemas-microsoft-com:vml" xmlns:wp14="http://schemas.microsoft.com/office/word/2010/wordprocessingDrawing" xmlns:wp="http://schemas.openxmlformats.org/drawingml/2006/wordprocessingDrawing" xmlns:w10="urn:schemas-microsoft-com:office:word" xmlns:w="http://schemas.openxmlformats.org/wordprocessingml/2006/main" xmlns:w14="http://schemas.microsoft.com/office/word/2010/wordml" xmlns:w15="http://schemas.microsoft.com/office/word/2012/wordml" xmlns:w16cei="http://schemas.microsoft.com/office/word/2026/wordml/cei" xmlns:w16cex="http://schemas.microsoft.com/office/word/2018/wordml/cex" xmlns:w16cid="http://schemas.microsoft.com/office/word/2016/wordml/cid" xmlns:w16="http://schemas.microsoft.com/office/word/2018/wordml" xmlns:w16du="http://schemas.microsoft.com/office/word/2023/wordml/word16du" xmlns:w16sdtdh="http://schemas.microsoft.com/office/word/2020/wordml/sdtdatahash" xmlns:w16sdtfl="http://schemas.microsoft.com/office/word/2024/wordml/sdtformatlock" xmlns:w16se="http://schemas.microsoft.com/office/word/2015/wordml/symex" xmlns:wpg="http://schemas.microsoft.com/office/word/2010/wordprocessingGroup" xmlns:wpi="http://schemas.microsoft.com/office/word/2010/wordprocessingInk" xmlns:wne="http://schemas.microsoft.com/office/word/2006/wordml" xmlns:wps="http://schemas.microsoft.com/office/word/2010/wordprocessingShape" mc:Ignorable="w14 w15 w16se w16cid w16 w16cex w16sdtdh w16sdtfl w16du wp14">
+<w:document xmlns:wpc="http://schemas.microsoft.com/office/word/2010/wordprocessingCanvas" xmlns:cx="http://schemas.microsoft.com/office/drawing/2014/chartex" xmlns:mc="http://schemas.openxmlformats.org/markup-compatibility/2006" xmlns:o="urn:schemas-microsoft-com:office:office" xmlns:r="http://schemas.openxmlformats.org/officeDocument/2006/relationships" xmlns:m="http://schemas.openxmlformats.org/officeDocument/2006/math" xmlns:v="urn:schemas-microsoft-com:vml" xmlns:wp14="http://schemas.microsoft.com/office/word/2010/wordprocessingDrawing" xmlns:wp="http://schemas.openxmlformats.org/drawingml/2006/wordprocessingDrawing" xmlns:w10="urn:schemas-microsoft-com:office:word" xmlns:w="http://schemas.openxmlformats.org/wordprocessingml/2006/main" xmlns:w14="http://schemas.microsoft.com/office/word/2010/wordml" xmlns:w15="http://schemas.microsoft.com/office/word/2012/wordml" xmlns:w16se="http://schemas.microsoft.com/office/word/2015/wordml/symex" xmlns:wpg="http://schemas.microsoft.com/office/word/2010/wordprocessingGroup" xmlns:wpi="http://schemas.microsoft.com/office/word/2010/wordprocessingInk" xmlns:wne="http://schemas.microsoft.com/office/word/2006/wordml" xmlns:wps="http://schemas.microsoft.com/office/word/2010/wordprocessingShape" mc:Ignorable="w14 w15 w16se wp14">
   <w:body>
     <w:tbl>
       <w:tblPr>
@@ -384,6 +384,12 @@
                 <w:rFonts w:ascii="Arial" w:eastAsia="Times New Roman" w:hAnsi="Arial"/>
               </w:rPr>
             </w:pPr>
+            <w:r>
+              <w:rPr>
+                <w:rFonts w:ascii="Arial" w:eastAsia="Times New Roman" w:hAnsi="Arial"/>
+              </w:rPr>
+              <w:t>M. Nafayh Akhlaq</w:t>
+            </w:r>
           </w:p>
         </w:tc>
         <w:tc>
@@ -398,6 +404,12 @@
                 <w:rFonts w:ascii="Arial" w:eastAsia="Times New Roman" w:hAnsi="Arial"/>
               </w:rPr>
             </w:pPr>
+            <w:r>
+              <w:rPr>
+                <w:rFonts w:ascii="Arial" w:eastAsia="Times New Roman" w:hAnsi="Arial"/>
+              </w:rPr>
+              <w:t>25i-6180</w:t>
+            </w:r>
           </w:p>
         </w:tc>
         <w:tc>
@@ -413,6 +425,12 @@
                 <w:rFonts w:ascii="Arial" w:eastAsia="Times New Roman" w:hAnsi="Arial"/>
               </w:rPr>
             </w:pPr>
+            <w:r>
+              <w:rPr>
+                <w:rFonts w:ascii="Arial" w:eastAsia="Times New Roman" w:hAnsi="Arial"/>
+              </w:rPr>
+              <w:t>EE-C</w:t>
+            </w:r>
           </w:p>
         </w:tc>
       </w:tr>
@@ -697,6 +715,7 @@
               </w:rPr>
               <w:t xml:space="preserve">Engr. </w:t>
             </w:r>
+            <w:proofErr w:type="spellStart"/>
             <w:r>
               <w:rPr>
                 <w:rFonts w:ascii="Arial" w:eastAsia="Times New Roman" w:hAnsi="Arial"/>
@@ -704,8 +723,29 @@
                 <w:sz w:val="20"/>
                 <w:szCs w:val="20"/>
               </w:rPr>
-              <w:t>Zulkaif Sajjad</w:t>
+              <w:t>Zulkaif</w:t>
             </w:r>
+            <w:proofErr w:type="spellEnd"/>
+            <w:r>
+              <w:rPr>
+                <w:rFonts w:ascii="Arial" w:eastAsia="Times New Roman" w:hAnsi="Arial"/>
+                <w:b/>
+                <w:sz w:val="20"/>
+                <w:szCs w:val="20"/>
+              </w:rPr>
+              <w:t xml:space="preserve"> </w:t>
+            </w:r>
+            <w:proofErr w:type="spellStart"/>
+            <w:r>
+              <w:rPr>
+                <w:rFonts w:ascii="Arial" w:eastAsia="Times New Roman" w:hAnsi="Arial"/>
+                <w:b/>
+                <w:sz w:val="20"/>
+                <w:szCs w:val="20"/>
+              </w:rPr>
+              <w:t>Sajjad</w:t>
+            </w:r>
+            <w:proofErr w:type="spellEnd"/>
           </w:p>
         </w:tc>
       </w:tr>
@@ -926,14 +966,34 @@
               </w:rPr>
               <w:t xml:space="preserve">Engr. </w:t>
             </w:r>
+            <w:proofErr w:type="spellStart"/>
             <w:r>
               <w:rPr>
                 <w:rFonts w:ascii="Arial" w:eastAsia="Times New Roman" w:hAnsi="Arial" w:cs="Times New Roman"/>
                 <w:color w:val="000000"/>
                 <w:sz w:val="20"/>
               </w:rPr>
-              <w:t>Zulkaif Sajjad</w:t>
+              <w:t>Zulkaif</w:t>
             </w:r>
+            <w:proofErr w:type="spellEnd"/>
+            <w:r>
+              <w:rPr>
+                <w:rFonts w:ascii="Arial" w:eastAsia="Times New Roman" w:hAnsi="Arial" w:cs="Times New Roman"/>
+                <w:color w:val="000000"/>
+                <w:sz w:val="20"/>
+              </w:rPr>
+              <w:t xml:space="preserve"> </w:t>
+            </w:r>
+            <w:proofErr w:type="spellStart"/>
+            <w:r>
+              <w:rPr>
+                <w:rFonts w:ascii="Arial" w:eastAsia="Times New Roman" w:hAnsi="Arial" w:cs="Times New Roman"/>
+                <w:color w:val="000000"/>
+                <w:sz w:val="20"/>
+              </w:rPr>
+              <w:t>Sajjad</w:t>
+            </w:r>
+            <w:proofErr w:type="spellEnd"/>
           </w:p>
         </w:tc>
         <w:tc>
@@ -1081,13 +1141,23 @@
               </w:rPr>
               <w:t xml:space="preserve">Engr. </w:t>
             </w:r>
+            <w:proofErr w:type="spellStart"/>
             <w:r>
               <w:rPr>
                 <w:rFonts w:ascii="Arial" w:eastAsia="Times New Roman" w:hAnsi="Arial" w:cs="Times New Roman"/>
                 <w:color w:val="000000"/>
                 <w:sz w:val="20"/>
               </w:rPr>
-              <w:t>Shahid Qureshi</w:t>
+              <w:t>Shahid</w:t>
+            </w:r>
+            <w:proofErr w:type="spellEnd"/>
+            <w:r>
+              <w:rPr>
+                <w:rFonts w:ascii="Arial" w:eastAsia="Times New Roman" w:hAnsi="Arial" w:cs="Times New Roman"/>
+                <w:color w:val="000000"/>
+                <w:sz w:val="20"/>
+              </w:rPr>
+              <w:t xml:space="preserve"> Qureshi</w:t>
             </w:r>
           </w:p>
         </w:tc>
@@ -1478,7 +1548,29 @@
                                 <w:szCs w:val="20"/>
                                 <w14:ligatures w14:val="none"/>
                               </w:rPr>
-                              <w:t>class ClassName {</w:t>
+                              <w:t xml:space="preserve">class </w:t>
+                            </w:r>
+                            <w:proofErr w:type="spellStart"/>
+                            <w:r>
+                              <w:rPr>
+                                <w:rFonts w:ascii="Consolas" w:eastAsia="Times New Roman" w:hAnsi="Consolas" w:cs="Courier New"/>
+                                <w:kern w:val="0"/>
+                                <w:sz w:val="20"/>
+                                <w:szCs w:val="20"/>
+                                <w14:ligatures w14:val="none"/>
+                              </w:rPr>
+                              <w:t>ClassName</w:t>
+                            </w:r>
+                            <w:proofErr w:type="spellEnd"/>
+                            <w:r>
+                              <w:rPr>
+                                <w:rFonts w:ascii="Consolas" w:eastAsia="Times New Roman" w:hAnsi="Consolas" w:cs="Courier New"/>
+                                <w:kern w:val="0"/>
+                                <w:sz w:val="20"/>
+                                <w:szCs w:val="20"/>
+                                <w14:ligatures w14:val="none"/>
+                              </w:rPr>
+                              <w:t xml:space="preserve"> {</w:t>
                             </w:r>
                           </w:p>
                           <w:p>
@@ -1724,7 +1816,7 @@
               </wp:inline>
             </w:drawing>
           </mc:Choice>
-          <mc:Fallback>
+          <mc:Fallback xmlns:w16sdtfl="http://schemas.microsoft.com/office/word/2024/wordml/sdtformatlock" xmlns:w16sdtdh="http://schemas.microsoft.com/office/word/2020/wordml/sdtdatahash" xmlns:w16du="http://schemas.microsoft.com/office/word/2023/wordml/word16du" xmlns:w16="http://schemas.microsoft.com/office/word/2018/wordml" xmlns:w16cid="http://schemas.microsoft.com/office/word/2016/wordml/cid" xmlns:w16cex="http://schemas.microsoft.com/office/word/2018/wordml/cex" xmlns:w16cei="http://schemas.microsoft.com/office/word/2026/wordml/cei" xmlns:oel="http://schemas.microsoft.com/office/2019/extlst" xmlns:am3d="http://schemas.microsoft.com/office/drawing/2017/model3d" xmlns:aink="http://schemas.microsoft.com/office/drawing/2016/ink" xmlns:cx8="http://schemas.microsoft.com/office/drawing/2016/5/14/chartex" xmlns:cx7="http://schemas.microsoft.com/office/drawing/2016/5/13/chartex" xmlns:cx6="http://schemas.microsoft.com/office/drawing/2016/5/12/chartex" xmlns:cx5="http://schemas.microsoft.com/office/drawing/2016/5/11/chartex" xmlns:cx4="http://schemas.microsoft.com/office/drawing/2016/5/10/chartex" xmlns:cx3="http://schemas.microsoft.com/office/drawing/2016/5/9/chartex" xmlns:cx2="http://schemas.microsoft.com/office/drawing/2015/10/21/chartex" xmlns:cx1="http://schemas.microsoft.com/office/drawing/2015/9/8/chartex">
             <w:pict>
               <v:shapetype w14:anchorId="6A63C7BE" id="_x0000_t202" coordsize="21600,21600" o:spt="202" path="m,l,21600r21600,l21600,xe">
                 <v:stroke joinstyle="miter"/>
@@ -2092,7 +2184,29 @@
                                 <w:szCs w:val="20"/>
                                 <w14:ligatures w14:val="none"/>
                               </w:rPr>
-                              <w:t>#include &lt;iostream&gt;</w:t>
+                              <w:t>#include &lt;</w:t>
+                            </w:r>
+                            <w:proofErr w:type="spellStart"/>
+                            <w:r>
+                              <w:rPr>
+                                <w:rFonts w:ascii="Consolas" w:eastAsia="Times New Roman" w:hAnsi="Consolas" w:cs="Courier New"/>
+                                <w:kern w:val="0"/>
+                                <w:sz w:val="20"/>
+                                <w:szCs w:val="20"/>
+                                <w14:ligatures w14:val="none"/>
+                              </w:rPr>
+                              <w:t>iostream</w:t>
+                            </w:r>
+                            <w:proofErr w:type="spellEnd"/>
+                            <w:r>
+                              <w:rPr>
+                                <w:rFonts w:ascii="Consolas" w:eastAsia="Times New Roman" w:hAnsi="Consolas" w:cs="Courier New"/>
+                                <w:kern w:val="0"/>
+                                <w:sz w:val="20"/>
+                                <w:szCs w:val="20"/>
+                                <w14:ligatures w14:val="none"/>
+                              </w:rPr>
+                              <w:t>&gt;</w:t>
                             </w:r>
                           </w:p>
                           <w:p>
@@ -2114,7 +2228,29 @@
                                 <w:szCs w:val="20"/>
                                 <w14:ligatures w14:val="none"/>
                               </w:rPr>
-                              <w:t>using namespace std;</w:t>
+                              <w:t xml:space="preserve">using namespace </w:t>
+                            </w:r>
+                            <w:proofErr w:type="spellStart"/>
+                            <w:r>
+                              <w:rPr>
+                                <w:rFonts w:ascii="Consolas" w:eastAsia="Times New Roman" w:hAnsi="Consolas" w:cs="Courier New"/>
+                                <w:kern w:val="0"/>
+                                <w:sz w:val="20"/>
+                                <w:szCs w:val="20"/>
+                                <w14:ligatures w14:val="none"/>
+                              </w:rPr>
+                              <w:t>std</w:t>
+                            </w:r>
+                            <w:proofErr w:type="spellEnd"/>
+                            <w:r>
+                              <w:rPr>
+                                <w:rFonts w:ascii="Consolas" w:eastAsia="Times New Roman" w:hAnsi="Consolas" w:cs="Courier New"/>
+                                <w:kern w:val="0"/>
+                                <w:sz w:val="20"/>
+                                <w:szCs w:val="20"/>
+                                <w14:ligatures w14:val="none"/>
+                              </w:rPr>
+                              <w:t>;</w:t>
                             </w:r>
                           </w:p>
                           <w:p>
@@ -2210,15 +2346,27 @@
                                 <w14:ligatures w14:val="none"/>
                               </w:rPr>
                             </w:pPr>
-                            <w:r>
-                              <w:rPr>
-                                <w:rFonts w:ascii="Consolas" w:eastAsia="Times New Roman" w:hAnsi="Consolas" w:cs="Courier New"/>
-                                <w:kern w:val="0"/>
-                                <w:sz w:val="20"/>
-                                <w:szCs w:val="20"/>
-                                <w14:ligatures w14:val="none"/>
-                              </w:rPr>
-                              <w:t xml:space="preserve">int id; </w:t>
+                            <w:proofErr w:type="spellStart"/>
+                            <w:r>
+                              <w:rPr>
+                                <w:rFonts w:ascii="Consolas" w:eastAsia="Times New Roman" w:hAnsi="Consolas" w:cs="Courier New"/>
+                                <w:kern w:val="0"/>
+                                <w:sz w:val="20"/>
+                                <w:szCs w:val="20"/>
+                                <w14:ligatures w14:val="none"/>
+                              </w:rPr>
+                              <w:t>int</w:t>
+                            </w:r>
+                            <w:proofErr w:type="spellEnd"/>
+                            <w:r>
+                              <w:rPr>
+                                <w:rFonts w:ascii="Consolas" w:eastAsia="Times New Roman" w:hAnsi="Consolas" w:cs="Courier New"/>
+                                <w:kern w:val="0"/>
+                                <w:sz w:val="20"/>
+                                <w:szCs w:val="20"/>
+                                <w14:ligatures w14:val="none"/>
+                              </w:rPr>
+                              <w:t xml:space="preserve"> id; </w:t>
                             </w:r>
                             <w:r>
                               <w:rPr>
@@ -2252,7 +2400,29 @@
                                 <w:szCs w:val="20"/>
                                 <w14:ligatures w14:val="none"/>
                               </w:rPr>
-                              <w:t xml:space="preserve">float gpa; </w:t>
+                              <w:t xml:space="preserve">float </w:t>
+                            </w:r>
+                            <w:proofErr w:type="spellStart"/>
+                            <w:r>
+                              <w:rPr>
+                                <w:rFonts w:ascii="Consolas" w:eastAsia="Times New Roman" w:hAnsi="Consolas" w:cs="Courier New"/>
+                                <w:kern w:val="0"/>
+                                <w:sz w:val="20"/>
+                                <w:szCs w:val="20"/>
+                                <w14:ligatures w14:val="none"/>
+                              </w:rPr>
+                              <w:t>gpa</w:t>
+                            </w:r>
+                            <w:proofErr w:type="spellEnd"/>
+                            <w:r>
+                              <w:rPr>
+                                <w:rFonts w:ascii="Consolas" w:eastAsia="Times New Roman" w:hAnsi="Consolas" w:cs="Courier New"/>
+                                <w:kern w:val="0"/>
+                                <w:sz w:val="20"/>
+                                <w:szCs w:val="20"/>
+                                <w14:ligatures w14:val="none"/>
+                              </w:rPr>
+                              <w:t xml:space="preserve">; </w:t>
                             </w:r>
                             <w:r>
                               <w:rPr>
@@ -2346,7 +2516,75 @@
                                 <w:szCs w:val="20"/>
                                 <w14:ligatures w14:val="none"/>
                               </w:rPr>
-                              <w:t>void setData(int i, float g) {</w:t>
+                              <w:t xml:space="preserve">void </w:t>
+                            </w:r>
+                            <w:proofErr w:type="spellStart"/>
+                            <w:proofErr w:type="gramStart"/>
+                            <w:r>
+                              <w:rPr>
+                                <w:rFonts w:ascii="Consolas" w:eastAsia="Times New Roman" w:hAnsi="Consolas" w:cs="Courier New"/>
+                                <w:kern w:val="0"/>
+                                <w:sz w:val="20"/>
+                                <w:szCs w:val="20"/>
+                                <w14:ligatures w14:val="none"/>
+                              </w:rPr>
+                              <w:t>setData</w:t>
+                            </w:r>
+                            <w:proofErr w:type="spellEnd"/>
+                            <w:r>
+                              <w:rPr>
+                                <w:rFonts w:ascii="Consolas" w:eastAsia="Times New Roman" w:hAnsi="Consolas" w:cs="Courier New"/>
+                                <w:kern w:val="0"/>
+                                <w:sz w:val="20"/>
+                                <w:szCs w:val="20"/>
+                                <w14:ligatures w14:val="none"/>
+                              </w:rPr>
+                              <w:t>(</w:t>
+                            </w:r>
+                            <w:proofErr w:type="spellStart"/>
+                            <w:proofErr w:type="gramEnd"/>
+                            <w:r>
+                              <w:rPr>
+                                <w:rFonts w:ascii="Consolas" w:eastAsia="Times New Roman" w:hAnsi="Consolas" w:cs="Courier New"/>
+                                <w:kern w:val="0"/>
+                                <w:sz w:val="20"/>
+                                <w:szCs w:val="20"/>
+                                <w14:ligatures w14:val="none"/>
+                              </w:rPr>
+                              <w:t>int</w:t>
+                            </w:r>
+                            <w:proofErr w:type="spellEnd"/>
+                            <w:r>
+                              <w:rPr>
+                                <w:rFonts w:ascii="Consolas" w:eastAsia="Times New Roman" w:hAnsi="Consolas" w:cs="Courier New"/>
+                                <w:kern w:val="0"/>
+                                <w:sz w:val="20"/>
+                                <w:szCs w:val="20"/>
+                                <w14:ligatures w14:val="none"/>
+                              </w:rPr>
+                              <w:t xml:space="preserve"> </w:t>
+                            </w:r>
+                            <w:proofErr w:type="spellStart"/>
+                            <w:r>
+                              <w:rPr>
+                                <w:rFonts w:ascii="Consolas" w:eastAsia="Times New Roman" w:hAnsi="Consolas" w:cs="Courier New"/>
+                                <w:kern w:val="0"/>
+                                <w:sz w:val="20"/>
+                                <w:szCs w:val="20"/>
+                                <w14:ligatures w14:val="none"/>
+                              </w:rPr>
+                              <w:t>i</w:t>
+                            </w:r>
+                            <w:proofErr w:type="spellEnd"/>
+                            <w:r>
+                              <w:rPr>
+                                <w:rFonts w:ascii="Consolas" w:eastAsia="Times New Roman" w:hAnsi="Consolas" w:cs="Courier New"/>
+                                <w:kern w:val="0"/>
+                                <w:sz w:val="20"/>
+                                <w:szCs w:val="20"/>
+                                <w14:ligatures w14:val="none"/>
+                              </w:rPr>
+                              <w:t>, float g) {</w:t>
                             </w:r>
                           </w:p>
                           <w:p>
@@ -2368,7 +2606,29 @@
                                 <w:szCs w:val="20"/>
                                 <w14:ligatures w14:val="none"/>
                               </w:rPr>
-                              <w:t>id = i;</w:t>
+                              <w:t xml:space="preserve">id = </w:t>
+                            </w:r>
+                            <w:proofErr w:type="spellStart"/>
+                            <w:r>
+                              <w:rPr>
+                                <w:rFonts w:ascii="Consolas" w:eastAsia="Times New Roman" w:hAnsi="Consolas" w:cs="Courier New"/>
+                                <w:kern w:val="0"/>
+                                <w:sz w:val="20"/>
+                                <w:szCs w:val="20"/>
+                                <w14:ligatures w14:val="none"/>
+                              </w:rPr>
+                              <w:t>i</w:t>
+                            </w:r>
+                            <w:proofErr w:type="spellEnd"/>
+                            <w:r>
+                              <w:rPr>
+                                <w:rFonts w:ascii="Consolas" w:eastAsia="Times New Roman" w:hAnsi="Consolas" w:cs="Courier New"/>
+                                <w:kern w:val="0"/>
+                                <w:sz w:val="20"/>
+                                <w:szCs w:val="20"/>
+                                <w14:ligatures w14:val="none"/>
+                              </w:rPr>
+                              <w:t>;</w:t>
                             </w:r>
                           </w:p>
                           <w:p>
@@ -2382,15 +2642,27 @@
                                 <w14:ligatures w14:val="none"/>
                               </w:rPr>
                             </w:pPr>
-                            <w:r>
-                              <w:rPr>
-                                <w:rFonts w:ascii="Consolas" w:eastAsia="Times New Roman" w:hAnsi="Consolas" w:cs="Courier New"/>
-                                <w:kern w:val="0"/>
-                                <w:sz w:val="20"/>
-                                <w:szCs w:val="20"/>
-                                <w14:ligatures w14:val="none"/>
-                              </w:rPr>
-                              <w:t>gpa = g;</w:t>
+                            <w:proofErr w:type="spellStart"/>
+                            <w:r>
+                              <w:rPr>
+                                <w:rFonts w:ascii="Consolas" w:eastAsia="Times New Roman" w:hAnsi="Consolas" w:cs="Courier New"/>
+                                <w:kern w:val="0"/>
+                                <w:sz w:val="20"/>
+                                <w:szCs w:val="20"/>
+                                <w14:ligatures w14:val="none"/>
+                              </w:rPr>
+                              <w:t>gpa</w:t>
+                            </w:r>
+                            <w:proofErr w:type="spellEnd"/>
+                            <w:r>
+                              <w:rPr>
+                                <w:rFonts w:ascii="Consolas" w:eastAsia="Times New Roman" w:hAnsi="Consolas" w:cs="Courier New"/>
+                                <w:kern w:val="0"/>
+                                <w:sz w:val="20"/>
+                                <w:szCs w:val="20"/>
+                                <w14:ligatures w14:val="none"/>
+                              </w:rPr>
+                              <w:t xml:space="preserve"> = g;</w:t>
                             </w:r>
                           </w:p>
                           <w:p>
@@ -2472,7 +2744,29 @@
                                 <w:szCs w:val="20"/>
                                 <w14:ligatures w14:val="none"/>
                               </w:rPr>
-                              <w:t>void display() {</w:t>
+                              <w:t xml:space="preserve">void </w:t>
+                            </w:r>
+                            <w:proofErr w:type="gramStart"/>
+                            <w:r>
+                              <w:rPr>
+                                <w:rFonts w:ascii="Consolas" w:eastAsia="Times New Roman" w:hAnsi="Consolas" w:cs="Courier New"/>
+                                <w:kern w:val="0"/>
+                                <w:sz w:val="20"/>
+                                <w:szCs w:val="20"/>
+                                <w14:ligatures w14:val="none"/>
+                              </w:rPr>
+                              <w:t>display(</w:t>
+                            </w:r>
+                            <w:proofErr w:type="gramEnd"/>
+                            <w:r>
+                              <w:rPr>
+                                <w:rFonts w:ascii="Consolas" w:eastAsia="Times New Roman" w:hAnsi="Consolas" w:cs="Courier New"/>
+                                <w:kern w:val="0"/>
+                                <w:sz w:val="20"/>
+                                <w:szCs w:val="20"/>
+                                <w14:ligatures w14:val="none"/>
+                              </w:rPr>
+                              <w:t>) {</w:t>
                             </w:r>
                           </w:p>
                           <w:p>
@@ -2516,7 +2810,29 @@
                                 <w:szCs w:val="20"/>
                                 <w14:ligatures w14:val="none"/>
                               </w:rPr>
-                              <w:t>cout &lt;&lt; "GPA: " &lt;&lt; gpa &lt;&lt; endl;</w:t>
+                              <w:t xml:space="preserve">cout &lt;&lt; "GPA: " &lt;&lt; </w:t>
+                            </w:r>
+                            <w:proofErr w:type="spellStart"/>
+                            <w:r>
+                              <w:rPr>
+                                <w:rFonts w:ascii="Consolas" w:eastAsia="Times New Roman" w:hAnsi="Consolas" w:cs="Courier New"/>
+                                <w:kern w:val="0"/>
+                                <w:sz w:val="20"/>
+                                <w:szCs w:val="20"/>
+                                <w14:ligatures w14:val="none"/>
+                              </w:rPr>
+                              <w:t>gpa</w:t>
+                            </w:r>
+                            <w:proofErr w:type="spellEnd"/>
+                            <w:r>
+                              <w:rPr>
+                                <w:rFonts w:ascii="Consolas" w:eastAsia="Times New Roman" w:hAnsi="Consolas" w:cs="Courier New"/>
+                                <w:kern w:val="0"/>
+                                <w:sz w:val="20"/>
+                                <w:szCs w:val="20"/>
+                                <w14:ligatures w14:val="none"/>
+                              </w:rPr>
+                              <w:t xml:space="preserve"> &lt;&lt; endl;</w:t>
                             </w:r>
                           </w:p>
                           <w:p>
@@ -2586,15 +2902,49 @@
                                 <w14:ligatures w14:val="none"/>
                               </w:rPr>
                             </w:pPr>
-                            <w:r>
-                              <w:rPr>
-                                <w:rFonts w:ascii="Consolas" w:eastAsia="Times New Roman" w:hAnsi="Consolas" w:cs="Courier New"/>
-                                <w:kern w:val="0"/>
-                                <w:sz w:val="20"/>
-                                <w:szCs w:val="20"/>
-                                <w14:ligatures w14:val="none"/>
-                              </w:rPr>
-                              <w:t>int main() {</w:t>
+                            <w:proofErr w:type="spellStart"/>
+                            <w:r>
+                              <w:rPr>
+                                <w:rFonts w:ascii="Consolas" w:eastAsia="Times New Roman" w:hAnsi="Consolas" w:cs="Courier New"/>
+                                <w:kern w:val="0"/>
+                                <w:sz w:val="20"/>
+                                <w:szCs w:val="20"/>
+                                <w14:ligatures w14:val="none"/>
+                              </w:rPr>
+                              <w:t>int</w:t>
+                            </w:r>
+                            <w:proofErr w:type="spellEnd"/>
+                            <w:r>
+                              <w:rPr>
+                                <w:rFonts w:ascii="Consolas" w:eastAsia="Times New Roman" w:hAnsi="Consolas" w:cs="Courier New"/>
+                                <w:kern w:val="0"/>
+                                <w:sz w:val="20"/>
+                                <w:szCs w:val="20"/>
+                                <w14:ligatures w14:val="none"/>
+                              </w:rPr>
+                              <w:t xml:space="preserve"> </w:t>
+                            </w:r>
+                            <w:proofErr w:type="gramStart"/>
+                            <w:r>
+                              <w:rPr>
+                                <w:rFonts w:ascii="Consolas" w:eastAsia="Times New Roman" w:hAnsi="Consolas" w:cs="Courier New"/>
+                                <w:kern w:val="0"/>
+                                <w:sz w:val="20"/>
+                                <w:szCs w:val="20"/>
+                                <w14:ligatures w14:val="none"/>
+                              </w:rPr>
+                              <w:t>main(</w:t>
+                            </w:r>
+                            <w:proofErr w:type="gramEnd"/>
+                            <w:r>
+                              <w:rPr>
+                                <w:rFonts w:ascii="Consolas" w:eastAsia="Times New Roman" w:hAnsi="Consolas" w:cs="Courier New"/>
+                                <w:kern w:val="0"/>
+                                <w:sz w:val="20"/>
+                                <w:szCs w:val="20"/>
+                                <w14:ligatures w14:val="none"/>
+                              </w:rPr>
+                              <w:t>) {</w:t>
                             </w:r>
                           </w:p>
                           <w:p>
@@ -2650,7 +3000,29 @@
                                 <w:szCs w:val="20"/>
                                 <w14:ligatures w14:val="none"/>
                               </w:rPr>
-                              <w:t xml:space="preserve">s1.setData(101, 3.45); </w:t>
+                              <w:t>s</w:t>
+                            </w:r>
+                            <w:proofErr w:type="gramStart"/>
+                            <w:r>
+                              <w:rPr>
+                                <w:rFonts w:ascii="Consolas" w:eastAsia="Times New Roman" w:hAnsi="Consolas" w:cs="Courier New"/>
+                                <w:kern w:val="0"/>
+                                <w:sz w:val="20"/>
+                                <w:szCs w:val="20"/>
+                                <w14:ligatures w14:val="none"/>
+                              </w:rPr>
+                              <w:t>1.setData</w:t>
+                            </w:r>
+                            <w:proofErr w:type="gramEnd"/>
+                            <w:r>
+                              <w:rPr>
+                                <w:rFonts w:ascii="Consolas" w:eastAsia="Times New Roman" w:hAnsi="Consolas" w:cs="Courier New"/>
+                                <w:kern w:val="0"/>
+                                <w:sz w:val="20"/>
+                                <w:szCs w:val="20"/>
+                                <w14:ligatures w14:val="none"/>
+                              </w:rPr>
+                              <w:t xml:space="preserve">(101, 3.45); </w:t>
                             </w:r>
                             <w:r>
                               <w:rPr>
@@ -2684,7 +3056,29 @@
                                 <w:szCs w:val="20"/>
                                 <w14:ligatures w14:val="none"/>
                               </w:rPr>
-                              <w:t xml:space="preserve">s1.display(); </w:t>
+                              <w:t>s</w:t>
+                            </w:r>
+                            <w:proofErr w:type="gramStart"/>
+                            <w:r>
+                              <w:rPr>
+                                <w:rFonts w:ascii="Consolas" w:eastAsia="Times New Roman" w:hAnsi="Consolas" w:cs="Courier New"/>
+                                <w:kern w:val="0"/>
+                                <w:sz w:val="20"/>
+                                <w:szCs w:val="20"/>
+                                <w14:ligatures w14:val="none"/>
+                              </w:rPr>
+                              <w:t>1.display</w:t>
+                            </w:r>
+                            <w:proofErr w:type="gramEnd"/>
+                            <w:r>
+                              <w:rPr>
+                                <w:rFonts w:ascii="Consolas" w:eastAsia="Times New Roman" w:hAnsi="Consolas" w:cs="Courier New"/>
+                                <w:kern w:val="0"/>
+                                <w:sz w:val="20"/>
+                                <w:szCs w:val="20"/>
+                                <w14:ligatures w14:val="none"/>
+                              </w:rPr>
+                              <w:t xml:space="preserve">(); </w:t>
                             </w:r>
                             <w:r>
                               <w:rPr>
@@ -2758,7 +3152,7 @@
               </wp:inline>
             </w:drawing>
           </mc:Choice>
-          <mc:Fallback>
+          <mc:Fallback xmlns:w16sdtfl="http://schemas.microsoft.com/office/word/2024/wordml/sdtformatlock" xmlns:w16sdtdh="http://schemas.microsoft.com/office/word/2020/wordml/sdtdatahash" xmlns:w16du="http://schemas.microsoft.com/office/word/2023/wordml/word16du" xmlns:w16="http://schemas.microsoft.com/office/word/2018/wordml" xmlns:w16cid="http://schemas.microsoft.com/office/word/2016/wordml/cid" xmlns:w16cex="http://schemas.microsoft.com/office/word/2018/wordml/cex" xmlns:w16cei="http://schemas.microsoft.com/office/word/2026/wordml/cei" xmlns:oel="http://schemas.microsoft.com/office/2019/extlst" xmlns:am3d="http://schemas.microsoft.com/office/drawing/2017/model3d" xmlns:aink="http://schemas.microsoft.com/office/drawing/2016/ink" xmlns:cx8="http://schemas.microsoft.com/office/drawing/2016/5/14/chartex" xmlns:cx7="http://schemas.microsoft.com/office/drawing/2016/5/13/chartex" xmlns:cx6="http://schemas.microsoft.com/office/drawing/2016/5/12/chartex" xmlns:cx5="http://schemas.microsoft.com/office/drawing/2016/5/11/chartex" xmlns:cx4="http://schemas.microsoft.com/office/drawing/2016/5/10/chartex" xmlns:cx3="http://schemas.microsoft.com/office/drawing/2016/5/9/chartex" xmlns:cx2="http://schemas.microsoft.com/office/drawing/2015/10/21/chartex" xmlns:cx1="http://schemas.microsoft.com/office/drawing/2015/9/8/chartex">
             <w:pict>
               <v:shape w14:anchorId="69CF0B61" id="Text Box 2" o:spid="_x0000_s1027" type="#_x0000_t202" style="width:472.2pt;height:346.8pt;visibility:visible;mso-wrap-style:square;mso-left-percent:-10001;mso-top-percent:-10001;mso-position-horizontal:absolute;mso-position-horizontal-relative:char;mso-position-vertical:absolute;mso-position-vertical-relative:line;mso-left-percent:-10001;mso-top-percent:-10001;v-text-anchor:top" o:gfxdata="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" fillcolor="white [3201]" strokeweight=".5pt">
                 <v:textbox>
@@ -3596,15 +3990,39 @@
                                 <w14:ligatures w14:val="none"/>
                               </w:rPr>
                             </w:pPr>
-                            <w:r>
-                              <w:rPr>
-                                <w:rFonts w:ascii="Consolas" w:eastAsia="Times New Roman" w:hAnsi="Consolas" w:cs="Courier New"/>
-                                <w:kern w:val="0"/>
-                                <w:sz w:val="20"/>
-                                <w:szCs w:val="20"/>
-                                <w14:ligatures w14:val="none"/>
-                              </w:rPr>
-                              <w:t>ClassName() {</w:t>
+                            <w:proofErr w:type="spellStart"/>
+                            <w:proofErr w:type="gramStart"/>
+                            <w:r>
+                              <w:rPr>
+                                <w:rFonts w:ascii="Consolas" w:eastAsia="Times New Roman" w:hAnsi="Consolas" w:cs="Courier New"/>
+                                <w:kern w:val="0"/>
+                                <w:sz w:val="20"/>
+                                <w:szCs w:val="20"/>
+                                <w14:ligatures w14:val="none"/>
+                              </w:rPr>
+                              <w:t>ClassName</w:t>
+                            </w:r>
+                            <w:proofErr w:type="spellEnd"/>
+                            <w:r>
+                              <w:rPr>
+                                <w:rFonts w:ascii="Consolas" w:eastAsia="Times New Roman" w:hAnsi="Consolas" w:cs="Courier New"/>
+                                <w:kern w:val="0"/>
+                                <w:sz w:val="20"/>
+                                <w:szCs w:val="20"/>
+                                <w14:ligatures w14:val="none"/>
+                              </w:rPr>
+                              <w:t>(</w:t>
+                            </w:r>
+                            <w:proofErr w:type="gramEnd"/>
+                            <w:r>
+                              <w:rPr>
+                                <w:rFonts w:ascii="Consolas" w:eastAsia="Times New Roman" w:hAnsi="Consolas" w:cs="Courier New"/>
+                                <w:kern w:val="0"/>
+                                <w:sz w:val="20"/>
+                                <w:szCs w:val="20"/>
+                                <w14:ligatures w14:val="none"/>
+                              </w:rPr>
+                              <w:t>) {</w:t>
                             </w:r>
                           </w:p>
                           <w:p>
@@ -3716,7 +4134,7 @@
               </wp:inline>
             </w:drawing>
           </mc:Choice>
-          <mc:Fallback>
+          <mc:Fallback xmlns:w16sdtfl="http://schemas.microsoft.com/office/word/2024/wordml/sdtformatlock" xmlns:w16sdtdh="http://schemas.microsoft.com/office/word/2020/wordml/sdtdatahash" xmlns:w16du="http://schemas.microsoft.com/office/word/2023/wordml/word16du" xmlns:w16="http://schemas.microsoft.com/office/word/2018/wordml" xmlns:w16cid="http://schemas.microsoft.com/office/word/2016/wordml/cid" xmlns:w16cex="http://schemas.microsoft.com/office/word/2018/wordml/cex" xmlns:w16cei="http://schemas.microsoft.com/office/word/2026/wordml/cei" xmlns:oel="http://schemas.microsoft.com/office/2019/extlst" xmlns:am3d="http://schemas.microsoft.com/office/drawing/2017/model3d" xmlns:aink="http://schemas.microsoft.com/office/drawing/2016/ink" xmlns:cx8="http://schemas.microsoft.com/office/drawing/2016/5/14/chartex" xmlns:cx7="http://schemas.microsoft.com/office/drawing/2016/5/13/chartex" xmlns:cx6="http://schemas.microsoft.com/office/drawing/2016/5/12/chartex" xmlns:cx5="http://schemas.microsoft.com/office/drawing/2016/5/11/chartex" xmlns:cx4="http://schemas.microsoft.com/office/drawing/2016/5/10/chartex" xmlns:cx3="http://schemas.microsoft.com/office/drawing/2016/5/9/chartex" xmlns:cx2="http://schemas.microsoft.com/office/drawing/2015/10/21/chartex" xmlns:cx1="http://schemas.microsoft.com/office/drawing/2015/9/8/chartex">
             <w:pict>
               <v:shape w14:anchorId="0FC63128" id="Text Box 3" o:spid="_x0000_s1028" type="#_x0000_t202" style="width:476pt;height:48pt;visibility:visible;mso-wrap-style:square;mso-left-percent:-10001;mso-top-percent:-10001;mso-position-horizontal:absolute;mso-position-horizontal-relative:char;mso-position-vertical:absolute;mso-position-vertical-relative:line;mso-left-percent:-10001;mso-top-percent:-10001;v-text-anchor:top" o:gfxdata="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" fillcolor="white [3201]" strokeweight=".5pt">
                 <v:textbox>
@@ -4041,15 +4459,39 @@
                                 <w14:ligatures w14:val="none"/>
                               </w:rPr>
                             </w:pPr>
-                            <w:r>
-                              <w:rPr>
-                                <w:rFonts w:ascii="Consolas" w:eastAsia="Times New Roman" w:hAnsi="Consolas" w:cs="Courier New"/>
-                                <w:kern w:val="0"/>
-                                <w:sz w:val="20"/>
-                                <w:szCs w:val="20"/>
-                                <w14:ligatures w14:val="none"/>
-                              </w:rPr>
-                              <w:t>ClassName();</w:t>
+                            <w:proofErr w:type="spellStart"/>
+                            <w:proofErr w:type="gramStart"/>
+                            <w:r>
+                              <w:rPr>
+                                <w:rFonts w:ascii="Consolas" w:eastAsia="Times New Roman" w:hAnsi="Consolas" w:cs="Courier New"/>
+                                <w:kern w:val="0"/>
+                                <w:sz w:val="20"/>
+                                <w:szCs w:val="20"/>
+                                <w14:ligatures w14:val="none"/>
+                              </w:rPr>
+                              <w:t>ClassName</w:t>
+                            </w:r>
+                            <w:proofErr w:type="spellEnd"/>
+                            <w:r>
+                              <w:rPr>
+                                <w:rFonts w:ascii="Consolas" w:eastAsia="Times New Roman" w:hAnsi="Consolas" w:cs="Courier New"/>
+                                <w:kern w:val="0"/>
+                                <w:sz w:val="20"/>
+                                <w:szCs w:val="20"/>
+                                <w14:ligatures w14:val="none"/>
+                              </w:rPr>
+                              <w:t>(</w:t>
+                            </w:r>
+                            <w:proofErr w:type="gramEnd"/>
+                            <w:r>
+                              <w:rPr>
+                                <w:rFonts w:ascii="Consolas" w:eastAsia="Times New Roman" w:hAnsi="Consolas" w:cs="Courier New"/>
+                                <w:kern w:val="0"/>
+                                <w:sz w:val="20"/>
+                                <w:szCs w:val="20"/>
+                                <w14:ligatures w14:val="none"/>
+                              </w:rPr>
+                              <w:t>);</w:t>
                             </w:r>
                           </w:p>
                           <w:p/>
@@ -4067,7 +4509,7 @@
               </wp:inline>
             </w:drawing>
           </mc:Choice>
-          <mc:Fallback>
+          <mc:Fallback xmlns:w16sdtfl="http://schemas.microsoft.com/office/word/2024/wordml/sdtformatlock" xmlns:w16sdtdh="http://schemas.microsoft.com/office/word/2020/wordml/sdtdatahash" xmlns:w16du="http://schemas.microsoft.com/office/word/2023/wordml/word16du" xmlns:w16="http://schemas.microsoft.com/office/word/2018/wordml" xmlns:w16cid="http://schemas.microsoft.com/office/word/2016/wordml/cid" xmlns:w16cex="http://schemas.microsoft.com/office/word/2018/wordml/cex" xmlns:w16cei="http://schemas.microsoft.com/office/word/2026/wordml/cei" xmlns:oel="http://schemas.microsoft.com/office/2019/extlst" xmlns:am3d="http://schemas.microsoft.com/office/drawing/2017/model3d" xmlns:aink="http://schemas.microsoft.com/office/drawing/2016/ink" xmlns:cx8="http://schemas.microsoft.com/office/drawing/2016/5/14/chartex" xmlns:cx7="http://schemas.microsoft.com/office/drawing/2016/5/13/chartex" xmlns:cx6="http://schemas.microsoft.com/office/drawing/2016/5/12/chartex" xmlns:cx5="http://schemas.microsoft.com/office/drawing/2016/5/11/chartex" xmlns:cx4="http://schemas.microsoft.com/office/drawing/2016/5/10/chartex" xmlns:cx3="http://schemas.microsoft.com/office/drawing/2016/5/9/chartex" xmlns:cx2="http://schemas.microsoft.com/office/drawing/2015/10/21/chartex" xmlns:cx1="http://schemas.microsoft.com/office/drawing/2015/9/8/chartex">
             <w:pict>
               <v:shape w14:anchorId="0CD5CD00" id="Text Box 4" o:spid="_x0000_s1029" type="#_x0000_t202" style="width:473pt;height:23pt;visibility:visible;mso-wrap-style:square;mso-left-percent:-10001;mso-top-percent:-10001;mso-position-horizontal:absolute;mso-position-horizontal-relative:char;mso-position-vertical:absolute;mso-position-vertical-relative:line;mso-left-percent:-10001;mso-top-percent:-10001;v-text-anchor:top" o:gfxdata="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" fillcolor="white [3201]" strokeweight=".5pt">
                 <v:textbox>
@@ -4203,7 +4645,29 @@
                                 <w:szCs w:val="20"/>
                                 <w14:ligatures w14:val="none"/>
                               </w:rPr>
-                              <w:t>#include &lt;iostream&gt;</w:t>
+                              <w:t>#include &lt;</w:t>
+                            </w:r>
+                            <w:proofErr w:type="spellStart"/>
+                            <w:r>
+                              <w:rPr>
+                                <w:rFonts w:ascii="Consolas" w:eastAsia="Times New Roman" w:hAnsi="Consolas" w:cs="Courier New"/>
+                                <w:kern w:val="0"/>
+                                <w:sz w:val="20"/>
+                                <w:szCs w:val="20"/>
+                                <w14:ligatures w14:val="none"/>
+                              </w:rPr>
+                              <w:t>iostream</w:t>
+                            </w:r>
+                            <w:proofErr w:type="spellEnd"/>
+                            <w:r>
+                              <w:rPr>
+                                <w:rFonts w:ascii="Consolas" w:eastAsia="Times New Roman" w:hAnsi="Consolas" w:cs="Courier New"/>
+                                <w:kern w:val="0"/>
+                                <w:sz w:val="20"/>
+                                <w:szCs w:val="20"/>
+                                <w14:ligatures w14:val="none"/>
+                              </w:rPr>
+                              <w:t>&gt;</w:t>
                             </w:r>
                           </w:p>
                           <w:p>
@@ -4225,7 +4689,29 @@
                                 <w:szCs w:val="20"/>
                                 <w14:ligatures w14:val="none"/>
                               </w:rPr>
-                              <w:t>using namespace std;</w:t>
+                              <w:t xml:space="preserve">using namespace </w:t>
+                            </w:r>
+                            <w:proofErr w:type="spellStart"/>
+                            <w:r>
+                              <w:rPr>
+                                <w:rFonts w:ascii="Consolas" w:eastAsia="Times New Roman" w:hAnsi="Consolas" w:cs="Courier New"/>
+                                <w:kern w:val="0"/>
+                                <w:sz w:val="20"/>
+                                <w:szCs w:val="20"/>
+                                <w14:ligatures w14:val="none"/>
+                              </w:rPr>
+                              <w:t>std</w:t>
+                            </w:r>
+                            <w:proofErr w:type="spellEnd"/>
+                            <w:r>
+                              <w:rPr>
+                                <w:rFonts w:ascii="Consolas" w:eastAsia="Times New Roman" w:hAnsi="Consolas" w:cs="Courier New"/>
+                                <w:kern w:val="0"/>
+                                <w:sz w:val="20"/>
+                                <w:szCs w:val="20"/>
+                                <w14:ligatures w14:val="none"/>
+                              </w:rPr>
+                              <w:t>;</w:t>
                             </w:r>
                           </w:p>
                           <w:p>
@@ -4389,15 +4875,27 @@
                                 <w14:ligatures w14:val="none"/>
                               </w:rPr>
                             </w:pPr>
-                            <w:r>
-                              <w:rPr>
-                                <w:rFonts w:ascii="Consolas" w:eastAsia="Times New Roman" w:hAnsi="Consolas" w:cs="Courier New"/>
-                                <w:kern w:val="0"/>
-                                <w:sz w:val="20"/>
-                                <w:szCs w:val="20"/>
-                                <w14:ligatures w14:val="none"/>
-                              </w:rPr>
-                              <w:t>Course() {</w:t>
+                            <w:proofErr w:type="gramStart"/>
+                            <w:r>
+                              <w:rPr>
+                                <w:rFonts w:ascii="Consolas" w:eastAsia="Times New Roman" w:hAnsi="Consolas" w:cs="Courier New"/>
+                                <w:kern w:val="0"/>
+                                <w:sz w:val="20"/>
+                                <w:szCs w:val="20"/>
+                                <w14:ligatures w14:val="none"/>
+                              </w:rPr>
+                              <w:t>Course(</w:t>
+                            </w:r>
+                            <w:proofErr w:type="gramEnd"/>
+                            <w:r>
+                              <w:rPr>
+                                <w:rFonts w:ascii="Consolas" w:eastAsia="Times New Roman" w:hAnsi="Consolas" w:cs="Courier New"/>
+                                <w:kern w:val="0"/>
+                                <w:sz w:val="20"/>
+                                <w:szCs w:val="20"/>
+                                <w14:ligatures w14:val="none"/>
+                              </w:rPr>
+                              <w:t>) {</w:t>
                             </w:r>
                           </w:p>
                           <w:p>
@@ -4501,7 +4999,29 @@
                                 <w:szCs w:val="20"/>
                                 <w14:ligatures w14:val="none"/>
                               </w:rPr>
-                              <w:t>void show() {</w:t>
+                              <w:t xml:space="preserve">void </w:t>
+                            </w:r>
+                            <w:proofErr w:type="gramStart"/>
+                            <w:r>
+                              <w:rPr>
+                                <w:rFonts w:ascii="Consolas" w:eastAsia="Times New Roman" w:hAnsi="Consolas" w:cs="Courier New"/>
+                                <w:kern w:val="0"/>
+                                <w:sz w:val="20"/>
+                                <w:szCs w:val="20"/>
+                                <w14:ligatures w14:val="none"/>
+                              </w:rPr>
+                              <w:t>show(</w:t>
+                            </w:r>
+                            <w:proofErr w:type="gramEnd"/>
+                            <w:r>
+                              <w:rPr>
+                                <w:rFonts w:ascii="Consolas" w:eastAsia="Times New Roman" w:hAnsi="Consolas" w:cs="Courier New"/>
+                                <w:kern w:val="0"/>
+                                <w:sz w:val="20"/>
+                                <w:szCs w:val="20"/>
+                                <w14:ligatures w14:val="none"/>
+                              </w:rPr>
+                              <w:t>) {</w:t>
                             </w:r>
                           </w:p>
                           <w:p>
@@ -4593,15 +5113,49 @@
                                 <w14:ligatures w14:val="none"/>
                               </w:rPr>
                             </w:pPr>
-                            <w:r>
-                              <w:rPr>
-                                <w:rFonts w:ascii="Consolas" w:eastAsia="Times New Roman" w:hAnsi="Consolas" w:cs="Courier New"/>
-                                <w:kern w:val="0"/>
-                                <w:sz w:val="20"/>
-                                <w:szCs w:val="20"/>
-                                <w14:ligatures w14:val="none"/>
-                              </w:rPr>
-                              <w:t>int main() {</w:t>
+                            <w:proofErr w:type="spellStart"/>
+                            <w:r>
+                              <w:rPr>
+                                <w:rFonts w:ascii="Consolas" w:eastAsia="Times New Roman" w:hAnsi="Consolas" w:cs="Courier New"/>
+                                <w:kern w:val="0"/>
+                                <w:sz w:val="20"/>
+                                <w:szCs w:val="20"/>
+                                <w14:ligatures w14:val="none"/>
+                              </w:rPr>
+                              <w:t>int</w:t>
+                            </w:r>
+                            <w:proofErr w:type="spellEnd"/>
+                            <w:r>
+                              <w:rPr>
+                                <w:rFonts w:ascii="Consolas" w:eastAsia="Times New Roman" w:hAnsi="Consolas" w:cs="Courier New"/>
+                                <w:kern w:val="0"/>
+                                <w:sz w:val="20"/>
+                                <w:szCs w:val="20"/>
+                                <w14:ligatures w14:val="none"/>
+                              </w:rPr>
+                              <w:t xml:space="preserve"> </w:t>
+                            </w:r>
+                            <w:proofErr w:type="gramStart"/>
+                            <w:r>
+                              <w:rPr>
+                                <w:rFonts w:ascii="Consolas" w:eastAsia="Times New Roman" w:hAnsi="Consolas" w:cs="Courier New"/>
+                                <w:kern w:val="0"/>
+                                <w:sz w:val="20"/>
+                                <w:szCs w:val="20"/>
+                                <w14:ligatures w14:val="none"/>
+                              </w:rPr>
+                              <w:t>main(</w:t>
+                            </w:r>
+                            <w:proofErr w:type="gramEnd"/>
+                            <w:r>
+                              <w:rPr>
+                                <w:rFonts w:ascii="Consolas" w:eastAsia="Times New Roman" w:hAnsi="Consolas" w:cs="Courier New"/>
+                                <w:kern w:val="0"/>
+                                <w:sz w:val="20"/>
+                                <w:szCs w:val="20"/>
+                                <w14:ligatures w14:val="none"/>
+                              </w:rPr>
+                              <w:t>) {</w:t>
                             </w:r>
                           </w:p>
                           <w:p>
@@ -4649,15 +5203,49 @@
                                 <w14:ligatures w14:val="none"/>
                               </w:rPr>
                             </w:pPr>
-                            <w:r>
-                              <w:rPr>
-                                <w:rFonts w:ascii="Consolas" w:eastAsia="Times New Roman" w:hAnsi="Consolas" w:cs="Courier New"/>
-                                <w:kern w:val="0"/>
-                                <w:sz w:val="20"/>
-                                <w:szCs w:val="20"/>
-                                <w14:ligatures w14:val="none"/>
-                              </w:rPr>
-                              <w:t>c.show();</w:t>
+                            <w:proofErr w:type="spellStart"/>
+                            <w:r>
+                              <w:rPr>
+                                <w:rFonts w:ascii="Consolas" w:eastAsia="Times New Roman" w:hAnsi="Consolas" w:cs="Courier New"/>
+                                <w:kern w:val="0"/>
+                                <w:sz w:val="20"/>
+                                <w:szCs w:val="20"/>
+                                <w14:ligatures w14:val="none"/>
+                              </w:rPr>
+                              <w:t>c.</w:t>
+                            </w:r>
+                            <w:proofErr w:type="gramStart"/>
+                            <w:r>
+                              <w:rPr>
+                                <w:rFonts w:ascii="Consolas" w:eastAsia="Times New Roman" w:hAnsi="Consolas" w:cs="Courier New"/>
+                                <w:kern w:val="0"/>
+                                <w:sz w:val="20"/>
+                                <w:szCs w:val="20"/>
+                                <w14:ligatures w14:val="none"/>
+                              </w:rPr>
+                              <w:t>show</w:t>
+                            </w:r>
+                            <w:proofErr w:type="spellEnd"/>
+                            <w:r>
+                              <w:rPr>
+                                <w:rFonts w:ascii="Consolas" w:eastAsia="Times New Roman" w:hAnsi="Consolas" w:cs="Courier New"/>
+                                <w:kern w:val="0"/>
+                                <w:sz w:val="20"/>
+                                <w:szCs w:val="20"/>
+                                <w14:ligatures w14:val="none"/>
+                              </w:rPr>
+                              <w:t>(</w:t>
+                            </w:r>
+                            <w:proofErr w:type="gramEnd"/>
+                            <w:r>
+                              <w:rPr>
+                                <w:rFonts w:ascii="Consolas" w:eastAsia="Times New Roman" w:hAnsi="Consolas" w:cs="Courier New"/>
+                                <w:kern w:val="0"/>
+                                <w:sz w:val="20"/>
+                                <w:szCs w:val="20"/>
+                                <w14:ligatures w14:val="none"/>
+                              </w:rPr>
+                              <w:t>);</w:t>
                             </w:r>
                           </w:p>
                           <w:p>
@@ -4723,7 +5311,7 @@
               </wp:inline>
             </w:drawing>
           </mc:Choice>
-          <mc:Fallback>
+          <mc:Fallback xmlns:w16sdtfl="http://schemas.microsoft.com/office/word/2024/wordml/sdtformatlock" xmlns:w16sdtdh="http://schemas.microsoft.com/office/word/2020/wordml/sdtdatahash" xmlns:w16du="http://schemas.microsoft.com/office/word/2023/wordml/word16du" xmlns:w16="http://schemas.microsoft.com/office/word/2018/wordml" xmlns:w16cid="http://schemas.microsoft.com/office/word/2016/wordml/cid" xmlns:w16cex="http://schemas.microsoft.com/office/word/2018/wordml/cex" xmlns:w16cei="http://schemas.microsoft.com/office/word/2026/wordml/cei" xmlns:oel="http://schemas.microsoft.com/office/2019/extlst" xmlns:am3d="http://schemas.microsoft.com/office/drawing/2017/model3d" xmlns:aink="http://schemas.microsoft.com/office/drawing/2016/ink" xmlns:cx8="http://schemas.microsoft.com/office/drawing/2016/5/14/chartex" xmlns:cx7="http://schemas.microsoft.com/office/drawing/2016/5/13/chartex" xmlns:cx6="http://schemas.microsoft.com/office/drawing/2016/5/12/chartex" xmlns:cx5="http://schemas.microsoft.com/office/drawing/2016/5/11/chartex" xmlns:cx4="http://schemas.microsoft.com/office/drawing/2016/5/10/chartex" xmlns:cx3="http://schemas.microsoft.com/office/drawing/2016/5/9/chartex" xmlns:cx2="http://schemas.microsoft.com/office/drawing/2015/10/21/chartex" xmlns:cx1="http://schemas.microsoft.com/office/drawing/2015/9/8/chartex">
             <w:pict>
               <v:shape w14:anchorId="6964C015" id="Text Box 5" o:spid="_x0000_s1030" type="#_x0000_t202" style="width:471.6pt;height:4in;visibility:visible;mso-wrap-style:square;mso-left-percent:-10001;mso-top-percent:-10001;mso-position-horizontal:absolute;mso-position-horizontal-relative:char;mso-position-vertical:absolute;mso-position-vertical-relative:line;mso-left-percent:-10001;mso-top-percent:-10001;v-text-anchor:top" o:gfxdata="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" fillcolor="white [3201]" strokeweight=".5pt">
                 <v:textbox>
@@ -5411,6 +5999,8 @@
                                 <w14:ligatures w14:val="none"/>
                               </w:rPr>
                             </w:pPr>
+                            <w:proofErr w:type="spellStart"/>
+                            <w:proofErr w:type="gramStart"/>
                             <w:r>
                               <w:rPr>
                                 <w:rFonts w:ascii="Courier New" w:eastAsia="Times New Roman" w:hAnsi="Courier New" w:cs="Courier New"/>
@@ -5419,7 +6009,51 @@
                                 <w:szCs w:val="20"/>
                                 <w14:ligatures w14:val="none"/>
                               </w:rPr>
-                              <w:t>ClassName(type var);</w:t>
+                              <w:t>ClassName</w:t>
+                            </w:r>
+                            <w:proofErr w:type="spellEnd"/>
+                            <w:r>
+                              <w:rPr>
+                                <w:rFonts w:ascii="Courier New" w:eastAsia="Times New Roman" w:hAnsi="Courier New" w:cs="Courier New"/>
+                                <w:kern w:val="0"/>
+                                <w:sz w:val="20"/>
+                                <w:szCs w:val="20"/>
+                                <w14:ligatures w14:val="none"/>
+                              </w:rPr>
+                              <w:t>(</w:t>
+                            </w:r>
+                            <w:proofErr w:type="gramEnd"/>
+                            <w:r>
+                              <w:rPr>
+                                <w:rFonts w:ascii="Courier New" w:eastAsia="Times New Roman" w:hAnsi="Courier New" w:cs="Courier New"/>
+                                <w:kern w:val="0"/>
+                                <w:sz w:val="20"/>
+                                <w:szCs w:val="20"/>
+                                <w14:ligatures w14:val="none"/>
+                              </w:rPr>
+                              <w:t xml:space="preserve">type </w:t>
+                            </w:r>
+                            <w:proofErr w:type="spellStart"/>
+                            <w:r>
+                              <w:rPr>
+                                <w:rFonts w:ascii="Courier New" w:eastAsia="Times New Roman" w:hAnsi="Courier New" w:cs="Courier New"/>
+                                <w:kern w:val="0"/>
+                                <w:sz w:val="20"/>
+                                <w:szCs w:val="20"/>
+                                <w14:ligatures w14:val="none"/>
+                              </w:rPr>
+                              <w:t>var</w:t>
+                            </w:r>
+                            <w:proofErr w:type="spellEnd"/>
+                            <w:r>
+                              <w:rPr>
+                                <w:rFonts w:ascii="Courier New" w:eastAsia="Times New Roman" w:hAnsi="Courier New" w:cs="Courier New"/>
+                                <w:kern w:val="0"/>
+                                <w:sz w:val="20"/>
+                                <w:szCs w:val="20"/>
+                                <w14:ligatures w14:val="none"/>
+                              </w:rPr>
+                              <w:t>);</w:t>
                             </w:r>
                           </w:p>
                         </w:txbxContent>
@@ -5436,7 +6070,7 @@
               </wp:inline>
             </w:drawing>
           </mc:Choice>
-          <mc:Fallback>
+          <mc:Fallback xmlns:w16sdtfl="http://schemas.microsoft.com/office/word/2024/wordml/sdtformatlock" xmlns:w16sdtdh="http://schemas.microsoft.com/office/word/2020/wordml/sdtdatahash" xmlns:w16du="http://schemas.microsoft.com/office/word/2023/wordml/word16du" xmlns:w16="http://schemas.microsoft.com/office/word/2018/wordml" xmlns:w16cid="http://schemas.microsoft.com/office/word/2016/wordml/cid" xmlns:w16cex="http://schemas.microsoft.com/office/word/2018/wordml/cex" xmlns:w16cei="http://schemas.microsoft.com/office/word/2026/wordml/cei" xmlns:oel="http://schemas.microsoft.com/office/2019/extlst" xmlns:am3d="http://schemas.microsoft.com/office/drawing/2017/model3d" xmlns:aink="http://schemas.microsoft.com/office/drawing/2016/ink" xmlns:cx8="http://schemas.microsoft.com/office/drawing/2016/5/14/chartex" xmlns:cx7="http://schemas.microsoft.com/office/drawing/2016/5/13/chartex" xmlns:cx6="http://schemas.microsoft.com/office/drawing/2016/5/12/chartex" xmlns:cx5="http://schemas.microsoft.com/office/drawing/2016/5/11/chartex" xmlns:cx4="http://schemas.microsoft.com/office/drawing/2016/5/10/chartex" xmlns:cx3="http://schemas.microsoft.com/office/drawing/2016/5/9/chartex" xmlns:cx2="http://schemas.microsoft.com/office/drawing/2015/10/21/chartex" xmlns:cx1="http://schemas.microsoft.com/office/drawing/2015/9/8/chartex">
             <w:pict>
               <v:shape w14:anchorId="799DC305" id="Text Box 10" o:spid="_x0000_s1031" type="#_x0000_t202" style="width:470.4pt;height:20pt;visibility:visible;mso-wrap-style:square;mso-left-percent:-10001;mso-top-percent:-10001;mso-position-horizontal:absolute;mso-position-horizontal-relative:char;mso-position-vertical:absolute;mso-position-vertical-relative:line;mso-left-percent:-10001;mso-top-percent:-10001;v-text-anchor:top" o:gfxdata="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" fillcolor="white [3201]" strokeweight=".5pt">
                 <v:textbox>
@@ -5592,7 +6226,29 @@
                                 <w:szCs w:val="20"/>
                                 <w14:ligatures w14:val="none"/>
                               </w:rPr>
-                              <w:t>#include &lt;iostream&gt;</w:t>
+                              <w:t>#include &lt;</w:t>
+                            </w:r>
+                            <w:proofErr w:type="spellStart"/>
+                            <w:r>
+                              <w:rPr>
+                                <w:rFonts w:ascii="Consolas" w:eastAsia="Times New Roman" w:hAnsi="Consolas" w:cs="Courier New"/>
+                                <w:kern w:val="0"/>
+                                <w:sz w:val="20"/>
+                                <w:szCs w:val="20"/>
+                                <w14:ligatures w14:val="none"/>
+                              </w:rPr>
+                              <w:t>iostream</w:t>
+                            </w:r>
+                            <w:proofErr w:type="spellEnd"/>
+                            <w:r>
+                              <w:rPr>
+                                <w:rFonts w:ascii="Consolas" w:eastAsia="Times New Roman" w:hAnsi="Consolas" w:cs="Courier New"/>
+                                <w:kern w:val="0"/>
+                                <w:sz w:val="20"/>
+                                <w:szCs w:val="20"/>
+                                <w14:ligatures w14:val="none"/>
+                              </w:rPr>
+                              <w:t>&gt;</w:t>
                             </w:r>
                           </w:p>
                           <w:p>
@@ -5633,7 +6289,29 @@
                                 <w:szCs w:val="20"/>
                                 <w14:ligatures w14:val="none"/>
                               </w:rPr>
-                              <w:t>using namespace std;</w:t>
+                              <w:t xml:space="preserve">using namespace </w:t>
+                            </w:r>
+                            <w:proofErr w:type="spellStart"/>
+                            <w:r>
+                              <w:rPr>
+                                <w:rFonts w:ascii="Consolas" w:eastAsia="Times New Roman" w:hAnsi="Consolas" w:cs="Courier New"/>
+                                <w:kern w:val="0"/>
+                                <w:sz w:val="20"/>
+                                <w:szCs w:val="20"/>
+                                <w14:ligatures w14:val="none"/>
+                              </w:rPr>
+                              <w:t>std</w:t>
+                            </w:r>
+                            <w:proofErr w:type="spellEnd"/>
+                            <w:r>
+                              <w:rPr>
+                                <w:rFonts w:ascii="Consolas" w:eastAsia="Times New Roman" w:hAnsi="Consolas" w:cs="Courier New"/>
+                                <w:kern w:val="0"/>
+                                <w:sz w:val="20"/>
+                                <w:szCs w:val="20"/>
+                                <w14:ligatures w14:val="none"/>
+                              </w:rPr>
+                              <w:t>;</w:t>
                             </w:r>
                           </w:p>
                           <w:p>
@@ -5832,15 +6510,27 @@
                                 <w14:ligatures w14:val="none"/>
                               </w:rPr>
                             </w:pPr>
-                            <w:r>
-                              <w:rPr>
-                                <w:rFonts w:ascii="Consolas" w:eastAsia="Times New Roman" w:hAnsi="Consolas" w:cs="Courier New"/>
-                                <w:kern w:val="0"/>
-                                <w:sz w:val="20"/>
-                                <w:szCs w:val="20"/>
-                                <w14:ligatures w14:val="none"/>
-                              </w:rPr>
-                              <w:t xml:space="preserve">int experience; </w:t>
+                            <w:proofErr w:type="spellStart"/>
+                            <w:r>
+                              <w:rPr>
+                                <w:rFonts w:ascii="Consolas" w:eastAsia="Times New Roman" w:hAnsi="Consolas" w:cs="Courier New"/>
+                                <w:kern w:val="0"/>
+                                <w:sz w:val="20"/>
+                                <w:szCs w:val="20"/>
+                                <w14:ligatures w14:val="none"/>
+                              </w:rPr>
+                              <w:t>int</w:t>
+                            </w:r>
+                            <w:proofErr w:type="spellEnd"/>
+                            <w:r>
+                              <w:rPr>
+                                <w:rFonts w:ascii="Consolas" w:eastAsia="Times New Roman" w:hAnsi="Consolas" w:cs="Courier New"/>
+                                <w:kern w:val="0"/>
+                                <w:sz w:val="20"/>
+                                <w:szCs w:val="20"/>
+                                <w14:ligatures w14:val="none"/>
+                              </w:rPr>
+                              <w:t xml:space="preserve"> experience; </w:t>
                             </w:r>
                             <w:r>
                               <w:rPr>
@@ -6002,15 +6692,49 @@
                                 <w14:ligatures w14:val="none"/>
                               </w:rPr>
                             </w:pPr>
-                            <w:r>
-                              <w:rPr>
-                                <w:rFonts w:ascii="Consolas" w:eastAsia="Times New Roman" w:hAnsi="Consolas" w:cs="Courier New"/>
-                                <w:kern w:val="0"/>
-                                <w:sz w:val="20"/>
-                                <w:szCs w:val="20"/>
-                                <w14:ligatures w14:val="none"/>
-                              </w:rPr>
-                              <w:t>Teacher(string n, int e) {</w:t>
+                            <w:proofErr w:type="gramStart"/>
+                            <w:r>
+                              <w:rPr>
+                                <w:rFonts w:ascii="Consolas" w:eastAsia="Times New Roman" w:hAnsi="Consolas" w:cs="Courier New"/>
+                                <w:kern w:val="0"/>
+                                <w:sz w:val="20"/>
+                                <w:szCs w:val="20"/>
+                                <w14:ligatures w14:val="none"/>
+                              </w:rPr>
+                              <w:t>Teacher(</w:t>
+                            </w:r>
+                            <w:proofErr w:type="gramEnd"/>
+                            <w:r>
+                              <w:rPr>
+                                <w:rFonts w:ascii="Consolas" w:eastAsia="Times New Roman" w:hAnsi="Consolas" w:cs="Courier New"/>
+                                <w:kern w:val="0"/>
+                                <w:sz w:val="20"/>
+                                <w:szCs w:val="20"/>
+                                <w14:ligatures w14:val="none"/>
+                              </w:rPr>
+                              <w:t xml:space="preserve">string n, </w:t>
+                            </w:r>
+                            <w:proofErr w:type="spellStart"/>
+                            <w:r>
+                              <w:rPr>
+                                <w:rFonts w:ascii="Consolas" w:eastAsia="Times New Roman" w:hAnsi="Consolas" w:cs="Courier New"/>
+                                <w:kern w:val="0"/>
+                                <w:sz w:val="20"/>
+                                <w:szCs w:val="20"/>
+                                <w14:ligatures w14:val="none"/>
+                              </w:rPr>
+                              <w:t>int</w:t>
+                            </w:r>
+                            <w:proofErr w:type="spellEnd"/>
+                            <w:r>
+                              <w:rPr>
+                                <w:rFonts w:ascii="Consolas" w:eastAsia="Times New Roman" w:hAnsi="Consolas" w:cs="Courier New"/>
+                                <w:kern w:val="0"/>
+                                <w:sz w:val="20"/>
+                                <w:szCs w:val="20"/>
+                                <w14:ligatures w14:val="none"/>
+                              </w:rPr>
+                              <w:t xml:space="preserve"> e) {</w:t>
                             </w:r>
                           </w:p>
                           <w:p>
@@ -6250,7 +6974,29 @@
                                 <w:szCs w:val="20"/>
                                 <w14:ligatures w14:val="none"/>
                               </w:rPr>
-                              <w:t>void display() {</w:t>
+                              <w:t xml:space="preserve">void </w:t>
+                            </w:r>
+                            <w:proofErr w:type="gramStart"/>
+                            <w:r>
+                              <w:rPr>
+                                <w:rFonts w:ascii="Consolas" w:eastAsia="Times New Roman" w:hAnsi="Consolas" w:cs="Courier New"/>
+                                <w:kern w:val="0"/>
+                                <w:sz w:val="20"/>
+                                <w:szCs w:val="20"/>
+                                <w14:ligatures w14:val="none"/>
+                              </w:rPr>
+                              <w:t>display(</w:t>
+                            </w:r>
+                            <w:proofErr w:type="gramEnd"/>
+                            <w:r>
+                              <w:rPr>
+                                <w:rFonts w:ascii="Consolas" w:eastAsia="Times New Roman" w:hAnsi="Consolas" w:cs="Courier New"/>
+                                <w:kern w:val="0"/>
+                                <w:sz w:val="20"/>
+                                <w:szCs w:val="20"/>
+                                <w14:ligatures w14:val="none"/>
+                              </w:rPr>
+                              <w:t>) {</w:t>
                             </w:r>
                           </w:p>
                           <w:p>
@@ -6478,15 +7224,49 @@
                                 <w14:ligatures w14:val="none"/>
                               </w:rPr>
                             </w:pPr>
-                            <w:r>
-                              <w:rPr>
-                                <w:rFonts w:ascii="Consolas" w:eastAsia="Times New Roman" w:hAnsi="Consolas" w:cs="Courier New"/>
-                                <w:kern w:val="0"/>
-                                <w:sz w:val="20"/>
-                                <w:szCs w:val="20"/>
-                                <w14:ligatures w14:val="none"/>
-                              </w:rPr>
-                              <w:t>int main() {</w:t>
+                            <w:proofErr w:type="spellStart"/>
+                            <w:r>
+                              <w:rPr>
+                                <w:rFonts w:ascii="Consolas" w:eastAsia="Times New Roman" w:hAnsi="Consolas" w:cs="Courier New"/>
+                                <w:kern w:val="0"/>
+                                <w:sz w:val="20"/>
+                                <w:szCs w:val="20"/>
+                                <w14:ligatures w14:val="none"/>
+                              </w:rPr>
+                              <w:t>int</w:t>
+                            </w:r>
+                            <w:proofErr w:type="spellEnd"/>
+                            <w:r>
+                              <w:rPr>
+                                <w:rFonts w:ascii="Consolas" w:eastAsia="Times New Roman" w:hAnsi="Consolas" w:cs="Courier New"/>
+                                <w:kern w:val="0"/>
+                                <w:sz w:val="20"/>
+                                <w:szCs w:val="20"/>
+                                <w14:ligatures w14:val="none"/>
+                              </w:rPr>
+                              <w:t xml:space="preserve"> </w:t>
+                            </w:r>
+                            <w:proofErr w:type="gramStart"/>
+                            <w:r>
+                              <w:rPr>
+                                <w:rFonts w:ascii="Consolas" w:eastAsia="Times New Roman" w:hAnsi="Consolas" w:cs="Courier New"/>
+                                <w:kern w:val="0"/>
+                                <w:sz w:val="20"/>
+                                <w:szCs w:val="20"/>
+                                <w14:ligatures w14:val="none"/>
+                              </w:rPr>
+                              <w:t>main(</w:t>
+                            </w:r>
+                            <w:proofErr w:type="gramEnd"/>
+                            <w:r>
+                              <w:rPr>
+                                <w:rFonts w:ascii="Consolas" w:eastAsia="Times New Roman" w:hAnsi="Consolas" w:cs="Courier New"/>
+                                <w:kern w:val="0"/>
+                                <w:sz w:val="20"/>
+                                <w:szCs w:val="20"/>
+                                <w14:ligatures w14:val="none"/>
+                              </w:rPr>
+                              <w:t>) {</w:t>
                             </w:r>
                           </w:p>
                           <w:p>
@@ -6527,7 +7307,29 @@
                                 <w:szCs w:val="20"/>
                                 <w14:ligatures w14:val="none"/>
                               </w:rPr>
-                              <w:t xml:space="preserve">Teacher t("Ali", 10); </w:t>
+                              <w:t xml:space="preserve">Teacher </w:t>
+                            </w:r>
+                            <w:proofErr w:type="gramStart"/>
+                            <w:r>
+                              <w:rPr>
+                                <w:rFonts w:ascii="Consolas" w:eastAsia="Times New Roman" w:hAnsi="Consolas" w:cs="Courier New"/>
+                                <w:kern w:val="0"/>
+                                <w:sz w:val="20"/>
+                                <w:szCs w:val="20"/>
+                                <w14:ligatures w14:val="none"/>
+                              </w:rPr>
+                              <w:t>t(</w:t>
+                            </w:r>
+                            <w:proofErr w:type="gramEnd"/>
+                            <w:r>
+                              <w:rPr>
+                                <w:rFonts w:ascii="Consolas" w:eastAsia="Times New Roman" w:hAnsi="Consolas" w:cs="Courier New"/>
+                                <w:kern w:val="0"/>
+                                <w:sz w:val="20"/>
+                                <w:szCs w:val="20"/>
+                                <w14:ligatures w14:val="none"/>
+                              </w:rPr>
+                              <w:t xml:space="preserve">"Ali", 10); </w:t>
                             </w:r>
                             <w:r>
                               <w:rPr>
@@ -6572,15 +7374,29 @@
                                 <w14:ligatures w14:val="none"/>
                               </w:rPr>
                             </w:pPr>
-                            <w:r>
-                              <w:rPr>
-                                <w:rFonts w:ascii="Consolas" w:eastAsia="Times New Roman" w:hAnsi="Consolas" w:cs="Courier New"/>
-                                <w:kern w:val="0"/>
-                                <w:sz w:val="20"/>
-                                <w:szCs w:val="20"/>
-                                <w14:ligatures w14:val="none"/>
-                              </w:rPr>
-                              <w:t>t.display();</w:t>
+                            <w:proofErr w:type="spellStart"/>
+                            <w:proofErr w:type="gramStart"/>
+                            <w:r>
+                              <w:rPr>
+                                <w:rFonts w:ascii="Consolas" w:eastAsia="Times New Roman" w:hAnsi="Consolas" w:cs="Courier New"/>
+                                <w:kern w:val="0"/>
+                                <w:sz w:val="20"/>
+                                <w:szCs w:val="20"/>
+                                <w14:ligatures w14:val="none"/>
+                              </w:rPr>
+                              <w:t>t.display</w:t>
+                            </w:r>
+                            <w:proofErr w:type="spellEnd"/>
+                            <w:proofErr w:type="gramEnd"/>
+                            <w:r>
+                              <w:rPr>
+                                <w:rFonts w:ascii="Consolas" w:eastAsia="Times New Roman" w:hAnsi="Consolas" w:cs="Courier New"/>
+                                <w:kern w:val="0"/>
+                                <w:sz w:val="20"/>
+                                <w:szCs w:val="20"/>
+                                <w14:ligatures w14:val="none"/>
+                              </w:rPr>
+                              <w:t>();</w:t>
                             </w:r>
                           </w:p>
                           <w:p>
@@ -6680,7 +7496,7 @@
               </wp:inline>
             </w:drawing>
           </mc:Choice>
-          <mc:Fallback>
+          <mc:Fallback xmlns:w16sdtfl="http://schemas.microsoft.com/office/word/2024/wordml/sdtformatlock" xmlns:w16sdtdh="http://schemas.microsoft.com/office/word/2020/wordml/sdtdatahash" xmlns:w16du="http://schemas.microsoft.com/office/word/2023/wordml/word16du" xmlns:w16="http://schemas.microsoft.com/office/word/2018/wordml" xmlns:w16cid="http://schemas.microsoft.com/office/word/2016/wordml/cid" xmlns:w16cex="http://schemas.microsoft.com/office/word/2018/wordml/cex" xmlns:w16cei="http://schemas.microsoft.com/office/word/2026/wordml/cei" xmlns:oel="http://schemas.microsoft.com/office/2019/extlst" xmlns:am3d="http://schemas.microsoft.com/office/drawing/2017/model3d" xmlns:aink="http://schemas.microsoft.com/office/drawing/2016/ink" xmlns:cx8="http://schemas.microsoft.com/office/drawing/2016/5/14/chartex" xmlns:cx7="http://schemas.microsoft.com/office/drawing/2016/5/13/chartex" xmlns:cx6="http://schemas.microsoft.com/office/drawing/2016/5/12/chartex" xmlns:cx5="http://schemas.microsoft.com/office/drawing/2016/5/11/chartex" xmlns:cx4="http://schemas.microsoft.com/office/drawing/2016/5/10/chartex" xmlns:cx3="http://schemas.microsoft.com/office/drawing/2016/5/9/chartex" xmlns:cx2="http://schemas.microsoft.com/office/drawing/2015/10/21/chartex" xmlns:cx1="http://schemas.microsoft.com/office/drawing/2015/9/8/chartex">
             <w:pict>
               <v:shape w14:anchorId="5F8AF1E7" id="Text Box 9" o:spid="_x0000_s1032" type="#_x0000_t202" style="width:466.25pt;height:328.3pt;visibility:visible;mso-wrap-style:square;mso-left-percent:-10001;mso-top-percent:-10001;mso-position-horizontal:absolute;mso-position-horizontal-relative:char;mso-position-vertical:absolute;mso-position-vertical-relative:line;mso-left-percent:-10001;mso-top-percent:-10001;v-text-anchor:top" o:gfxdata="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" fillcolor="white [3201]" strokeweight=".5pt">
                 <v:textbox>
@@ -7963,7 +8779,29 @@
                                 <w:szCs w:val="20"/>
                                 <w14:ligatures w14:val="none"/>
                               </w:rPr>
-                              <w:t>#include &lt;iostream&gt;</w:t>
+                              <w:t>#include &lt;</w:t>
+                            </w:r>
+                            <w:proofErr w:type="spellStart"/>
+                            <w:r>
+                              <w:rPr>
+                                <w:rFonts w:ascii="Consolas" w:eastAsia="Times New Roman" w:hAnsi="Consolas" w:cs="Courier New"/>
+                                <w:kern w:val="0"/>
+                                <w:sz w:val="20"/>
+                                <w:szCs w:val="20"/>
+                                <w14:ligatures w14:val="none"/>
+                              </w:rPr>
+                              <w:t>iostream</w:t>
+                            </w:r>
+                            <w:proofErr w:type="spellEnd"/>
+                            <w:r>
+                              <w:rPr>
+                                <w:rFonts w:ascii="Consolas" w:eastAsia="Times New Roman" w:hAnsi="Consolas" w:cs="Courier New"/>
+                                <w:kern w:val="0"/>
+                                <w:sz w:val="20"/>
+                                <w:szCs w:val="20"/>
+                                <w14:ligatures w14:val="none"/>
+                              </w:rPr>
+                              <w:t>&gt;</w:t>
                             </w:r>
                           </w:p>
                           <w:p>
@@ -8004,7 +8842,29 @@
                                 <w:szCs w:val="20"/>
                                 <w14:ligatures w14:val="none"/>
                               </w:rPr>
-                              <w:t>using namespace std;</w:t>
+                              <w:t xml:space="preserve">using namespace </w:t>
+                            </w:r>
+                            <w:proofErr w:type="spellStart"/>
+                            <w:r>
+                              <w:rPr>
+                                <w:rFonts w:ascii="Consolas" w:eastAsia="Times New Roman" w:hAnsi="Consolas" w:cs="Courier New"/>
+                                <w:kern w:val="0"/>
+                                <w:sz w:val="20"/>
+                                <w:szCs w:val="20"/>
+                                <w14:ligatures w14:val="none"/>
+                              </w:rPr>
+                              <w:t>std</w:t>
+                            </w:r>
+                            <w:proofErr w:type="spellEnd"/>
+                            <w:r>
+                              <w:rPr>
+                                <w:rFonts w:ascii="Consolas" w:eastAsia="Times New Roman" w:hAnsi="Consolas" w:cs="Courier New"/>
+                                <w:kern w:val="0"/>
+                                <w:sz w:val="20"/>
+                                <w:szCs w:val="20"/>
+                                <w14:ligatures w14:val="none"/>
+                              </w:rPr>
+                              <w:t>;</w:t>
                             </w:r>
                           </w:p>
                           <w:p>
@@ -8150,15 +9010,27 @@
                                 <w14:ligatures w14:val="none"/>
                               </w:rPr>
                             </w:pPr>
-                            <w:r>
-                              <w:rPr>
-                                <w:rFonts w:ascii="Consolas" w:eastAsia="Times New Roman" w:hAnsi="Consolas" w:cs="Courier New"/>
-                                <w:kern w:val="0"/>
-                                <w:sz w:val="20"/>
-                                <w:szCs w:val="20"/>
-                                <w14:ligatures w14:val="none"/>
-                              </w:rPr>
-                              <w:t xml:space="preserve">int computers; </w:t>
+                            <w:proofErr w:type="spellStart"/>
+                            <w:r>
+                              <w:rPr>
+                                <w:rFonts w:ascii="Consolas" w:eastAsia="Times New Roman" w:hAnsi="Consolas" w:cs="Courier New"/>
+                                <w:kern w:val="0"/>
+                                <w:sz w:val="20"/>
+                                <w:szCs w:val="20"/>
+                                <w14:ligatures w14:val="none"/>
+                              </w:rPr>
+                              <w:t>int</w:t>
+                            </w:r>
+                            <w:proofErr w:type="spellEnd"/>
+                            <w:r>
+                              <w:rPr>
+                                <w:rFonts w:ascii="Consolas" w:eastAsia="Times New Roman" w:hAnsi="Consolas" w:cs="Courier New"/>
+                                <w:kern w:val="0"/>
+                                <w:sz w:val="20"/>
+                                <w:szCs w:val="20"/>
+                                <w14:ligatures w14:val="none"/>
+                              </w:rPr>
+                              <w:t xml:space="preserve"> computers; </w:t>
                             </w:r>
                             <w:r>
                               <w:rPr>
@@ -8320,15 +9192,27 @@
                                 <w14:ligatures w14:val="none"/>
                               </w:rPr>
                             </w:pPr>
-                            <w:r>
-                              <w:rPr>
-                                <w:rFonts w:ascii="Consolas" w:eastAsia="Times New Roman" w:hAnsi="Consolas" w:cs="Courier New"/>
-                                <w:kern w:val="0"/>
-                                <w:sz w:val="20"/>
-                                <w:szCs w:val="20"/>
-                                <w14:ligatures w14:val="none"/>
-                              </w:rPr>
-                              <w:t>Lab() {</w:t>
+                            <w:proofErr w:type="gramStart"/>
+                            <w:r>
+                              <w:rPr>
+                                <w:rFonts w:ascii="Consolas" w:eastAsia="Times New Roman" w:hAnsi="Consolas" w:cs="Courier New"/>
+                                <w:kern w:val="0"/>
+                                <w:sz w:val="20"/>
+                                <w:szCs w:val="20"/>
+                                <w14:ligatures w14:val="none"/>
+                              </w:rPr>
+                              <w:t>Lab(</w:t>
+                            </w:r>
+                            <w:proofErr w:type="gramEnd"/>
+                            <w:r>
+                              <w:rPr>
+                                <w:rFonts w:ascii="Consolas" w:eastAsia="Times New Roman" w:hAnsi="Consolas" w:cs="Courier New"/>
+                                <w:kern w:val="0"/>
+                                <w:sz w:val="20"/>
+                                <w:szCs w:val="20"/>
+                                <w14:ligatures w14:val="none"/>
+                              </w:rPr>
+                              <w:t>) {</w:t>
                             </w:r>
                           </w:p>
                           <w:p>
@@ -8519,15 +9403,39 @@
                                 <w14:ligatures w14:val="none"/>
                               </w:rPr>
                             </w:pPr>
-                            <w:r>
-                              <w:rPr>
-                                <w:rFonts w:ascii="Consolas" w:eastAsia="Times New Roman" w:hAnsi="Consolas" w:cs="Courier New"/>
-                                <w:kern w:val="0"/>
-                                <w:sz w:val="20"/>
-                                <w:szCs w:val="20"/>
-                                <w14:ligatures w14:val="none"/>
-                              </w:rPr>
-                              <w:t>Lab(int c) {</w:t>
+                            <w:proofErr w:type="gramStart"/>
+                            <w:r>
+                              <w:rPr>
+                                <w:rFonts w:ascii="Consolas" w:eastAsia="Times New Roman" w:hAnsi="Consolas" w:cs="Courier New"/>
+                                <w:kern w:val="0"/>
+                                <w:sz w:val="20"/>
+                                <w:szCs w:val="20"/>
+                                <w14:ligatures w14:val="none"/>
+                              </w:rPr>
+                              <w:t>Lab(</w:t>
+                            </w:r>
+                            <w:proofErr w:type="spellStart"/>
+                            <w:proofErr w:type="gramEnd"/>
+                            <w:r>
+                              <w:rPr>
+                                <w:rFonts w:ascii="Consolas" w:eastAsia="Times New Roman" w:hAnsi="Consolas" w:cs="Courier New"/>
+                                <w:kern w:val="0"/>
+                                <w:sz w:val="20"/>
+                                <w:szCs w:val="20"/>
+                                <w14:ligatures w14:val="none"/>
+                              </w:rPr>
+                              <w:t>int</w:t>
+                            </w:r>
+                            <w:proofErr w:type="spellEnd"/>
+                            <w:r>
+                              <w:rPr>
+                                <w:rFonts w:ascii="Consolas" w:eastAsia="Times New Roman" w:hAnsi="Consolas" w:cs="Courier New"/>
+                                <w:kern w:val="0"/>
+                                <w:sz w:val="20"/>
+                                <w:szCs w:val="20"/>
+                                <w14:ligatures w14:val="none"/>
+                              </w:rPr>
+                              <w:t xml:space="preserve"> c) {</w:t>
                             </w:r>
                           </w:p>
                           <w:p>
@@ -8626,7 +9534,7 @@
               </wp:inline>
             </w:drawing>
           </mc:Choice>
-          <mc:Fallback>
+          <mc:Fallback xmlns:w16sdtfl="http://schemas.microsoft.com/office/word/2024/wordml/sdtformatlock" xmlns:w16sdtdh="http://schemas.microsoft.com/office/word/2020/wordml/sdtdatahash" xmlns:w16du="http://schemas.microsoft.com/office/word/2023/wordml/word16du" xmlns:w16="http://schemas.microsoft.com/office/word/2018/wordml" xmlns:w16cid="http://schemas.microsoft.com/office/word/2016/wordml/cid" xmlns:w16cex="http://schemas.microsoft.com/office/word/2018/wordml/cex" xmlns:w16cei="http://schemas.microsoft.com/office/word/2026/wordml/cei" xmlns:oel="http://schemas.microsoft.com/office/2019/extlst" xmlns:am3d="http://schemas.microsoft.com/office/drawing/2017/model3d" xmlns:aink="http://schemas.microsoft.com/office/drawing/2016/ink" xmlns:cx8="http://schemas.microsoft.com/office/drawing/2016/5/14/chartex" xmlns:cx7="http://schemas.microsoft.com/office/drawing/2016/5/13/chartex" xmlns:cx6="http://schemas.microsoft.com/office/drawing/2016/5/12/chartex" xmlns:cx5="http://schemas.microsoft.com/office/drawing/2016/5/11/chartex" xmlns:cx4="http://schemas.microsoft.com/office/drawing/2016/5/10/chartex" xmlns:cx3="http://schemas.microsoft.com/office/drawing/2016/5/9/chartex" xmlns:cx2="http://schemas.microsoft.com/office/drawing/2015/10/21/chartex" xmlns:cx1="http://schemas.microsoft.com/office/drawing/2015/9/8/chartex">
             <w:pict>
               <v:shape w14:anchorId="64F58819" id="Text Box 8" o:spid="_x0000_s1033" type="#_x0000_t202" style="width:465pt;height:212pt;visibility:visible;mso-wrap-style:square;mso-left-percent:-10001;mso-top-percent:-10001;mso-position-horizontal:absolute;mso-position-horizontal-relative:char;mso-position-vertical:absolute;mso-position-vertical-relative:line;mso-left-percent:-10001;mso-top-percent:-10001;v-text-anchor:top" o:gfxdata="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" fillcolor="white [3201]" strokeweight=".5pt">
                 <v:textbox>
@@ -9476,7 +10384,29 @@
                                 <w:szCs w:val="20"/>
                                 <w14:ligatures w14:val="none"/>
                               </w:rPr>
-                              <w:t>void show() {</w:t>
+                              <w:t xml:space="preserve">void </w:t>
+                            </w:r>
+                            <w:proofErr w:type="gramStart"/>
+                            <w:r>
+                              <w:rPr>
+                                <w:rFonts w:ascii="Consolas" w:eastAsia="Times New Roman" w:hAnsi="Consolas" w:cs="Courier New"/>
+                                <w:kern w:val="0"/>
+                                <w:sz w:val="20"/>
+                                <w:szCs w:val="20"/>
+                                <w14:ligatures w14:val="none"/>
+                              </w:rPr>
+                              <w:t>show(</w:t>
+                            </w:r>
+                            <w:proofErr w:type="gramEnd"/>
+                            <w:r>
+                              <w:rPr>
+                                <w:rFonts w:ascii="Consolas" w:eastAsia="Times New Roman" w:hAnsi="Consolas" w:cs="Courier New"/>
+                                <w:kern w:val="0"/>
+                                <w:sz w:val="20"/>
+                                <w:szCs w:val="20"/>
+                                <w14:ligatures w14:val="none"/>
+                              </w:rPr>
+                              <w:t>) {</w:t>
                             </w:r>
                           </w:p>
                           <w:p>
@@ -9632,15 +10562,49 @@
                                 <w14:ligatures w14:val="none"/>
                               </w:rPr>
                             </w:pPr>
-                            <w:r>
-                              <w:rPr>
-                                <w:rFonts w:ascii="Consolas" w:eastAsia="Times New Roman" w:hAnsi="Consolas" w:cs="Courier New"/>
-                                <w:kern w:val="0"/>
-                                <w:sz w:val="20"/>
-                                <w:szCs w:val="20"/>
-                                <w14:ligatures w14:val="none"/>
-                              </w:rPr>
-                              <w:t>int main() {</w:t>
+                            <w:proofErr w:type="spellStart"/>
+                            <w:r>
+                              <w:rPr>
+                                <w:rFonts w:ascii="Consolas" w:eastAsia="Times New Roman" w:hAnsi="Consolas" w:cs="Courier New"/>
+                                <w:kern w:val="0"/>
+                                <w:sz w:val="20"/>
+                                <w:szCs w:val="20"/>
+                                <w14:ligatures w14:val="none"/>
+                              </w:rPr>
+                              <w:t>int</w:t>
+                            </w:r>
+                            <w:proofErr w:type="spellEnd"/>
+                            <w:r>
+                              <w:rPr>
+                                <w:rFonts w:ascii="Consolas" w:eastAsia="Times New Roman" w:hAnsi="Consolas" w:cs="Courier New"/>
+                                <w:kern w:val="0"/>
+                                <w:sz w:val="20"/>
+                                <w:szCs w:val="20"/>
+                                <w14:ligatures w14:val="none"/>
+                              </w:rPr>
+                              <w:t xml:space="preserve"> </w:t>
+                            </w:r>
+                            <w:proofErr w:type="gramStart"/>
+                            <w:r>
+                              <w:rPr>
+                                <w:rFonts w:ascii="Consolas" w:eastAsia="Times New Roman" w:hAnsi="Consolas" w:cs="Courier New"/>
+                                <w:kern w:val="0"/>
+                                <w:sz w:val="20"/>
+                                <w:szCs w:val="20"/>
+                                <w14:ligatures w14:val="none"/>
+                              </w:rPr>
+                              <w:t>main(</w:t>
+                            </w:r>
+                            <w:proofErr w:type="gramEnd"/>
+                            <w:r>
+                              <w:rPr>
+                                <w:rFonts w:ascii="Consolas" w:eastAsia="Times New Roman" w:hAnsi="Consolas" w:cs="Courier New"/>
+                                <w:kern w:val="0"/>
+                                <w:sz w:val="20"/>
+                                <w:szCs w:val="20"/>
+                                <w14:ligatures w14:val="none"/>
+                              </w:rPr>
+                              <w:t>) {</w:t>
                             </w:r>
                           </w:p>
                           <w:p>
@@ -9822,7 +10786,29 @@
                                 <w:szCs w:val="20"/>
                                 <w14:ligatures w14:val="none"/>
                               </w:rPr>
-                              <w:t>l1.show();</w:t>
+                              <w:t>l</w:t>
+                            </w:r>
+                            <w:proofErr w:type="gramStart"/>
+                            <w:r>
+                              <w:rPr>
+                                <w:rFonts w:ascii="Consolas" w:eastAsia="Times New Roman" w:hAnsi="Consolas" w:cs="Courier New"/>
+                                <w:kern w:val="0"/>
+                                <w:sz w:val="20"/>
+                                <w:szCs w:val="20"/>
+                                <w14:ligatures w14:val="none"/>
+                              </w:rPr>
+                              <w:t>1.show</w:t>
+                            </w:r>
+                            <w:proofErr w:type="gramEnd"/>
+                            <w:r>
+                              <w:rPr>
+                                <w:rFonts w:ascii="Consolas" w:eastAsia="Times New Roman" w:hAnsi="Consolas" w:cs="Courier New"/>
+                                <w:kern w:val="0"/>
+                                <w:sz w:val="20"/>
+                                <w:szCs w:val="20"/>
+                                <w14:ligatures w14:val="none"/>
+                              </w:rPr>
+                              <w:t>();</w:t>
                             </w:r>
                           </w:p>
                           <w:p>
@@ -9863,7 +10849,29 @@
                                 <w:szCs w:val="20"/>
                                 <w14:ligatures w14:val="none"/>
                               </w:rPr>
-                              <w:t>l2.show();</w:t>
+                              <w:t>l</w:t>
+                            </w:r>
+                            <w:proofErr w:type="gramStart"/>
+                            <w:r>
+                              <w:rPr>
+                                <w:rFonts w:ascii="Consolas" w:eastAsia="Times New Roman" w:hAnsi="Consolas" w:cs="Courier New"/>
+                                <w:kern w:val="0"/>
+                                <w:sz w:val="20"/>
+                                <w:szCs w:val="20"/>
+                                <w14:ligatures w14:val="none"/>
+                              </w:rPr>
+                              <w:t>2.show</w:t>
+                            </w:r>
+                            <w:proofErr w:type="gramEnd"/>
+                            <w:r>
+                              <w:rPr>
+                                <w:rFonts w:ascii="Consolas" w:eastAsia="Times New Roman" w:hAnsi="Consolas" w:cs="Courier New"/>
+                                <w:kern w:val="0"/>
+                                <w:sz w:val="20"/>
+                                <w:szCs w:val="20"/>
+                                <w14:ligatures w14:val="none"/>
+                              </w:rPr>
+                              <w:t>();</w:t>
                             </w:r>
                           </w:p>
                           <w:p>
@@ -9963,7 +10971,7 @@
               </wp:inline>
             </w:drawing>
           </mc:Choice>
-          <mc:Fallback>
+          <mc:Fallback xmlns:w16sdtfl="http://schemas.microsoft.com/office/word/2024/wordml/sdtformatlock" xmlns:w16sdtdh="http://schemas.microsoft.com/office/word/2020/wordml/sdtdatahash" xmlns:w16du="http://schemas.microsoft.com/office/word/2023/wordml/word16du" xmlns:w16="http://schemas.microsoft.com/office/word/2018/wordml" xmlns:w16cid="http://schemas.microsoft.com/office/word/2016/wordml/cid" xmlns:w16cex="http://schemas.microsoft.com/office/word/2018/wordml/cex" xmlns:w16cei="http://schemas.microsoft.com/office/word/2026/wordml/cei" xmlns:oel="http://schemas.microsoft.com/office/2019/extlst" xmlns:am3d="http://schemas.microsoft.com/office/drawing/2017/model3d" xmlns:aink="http://schemas.microsoft.com/office/drawing/2016/ink" xmlns:cx8="http://schemas.microsoft.com/office/drawing/2016/5/14/chartex" xmlns:cx7="http://schemas.microsoft.com/office/drawing/2016/5/13/chartex" xmlns:cx6="http://schemas.microsoft.com/office/drawing/2016/5/12/chartex" xmlns:cx5="http://schemas.microsoft.com/office/drawing/2016/5/11/chartex" xmlns:cx4="http://schemas.microsoft.com/office/drawing/2016/5/10/chartex" xmlns:cx3="http://schemas.microsoft.com/office/drawing/2016/5/9/chartex" xmlns:cx2="http://schemas.microsoft.com/office/drawing/2015/10/21/chartex" xmlns:cx1="http://schemas.microsoft.com/office/drawing/2015/9/8/chartex">
             <w:pict>
               <v:shape w14:anchorId="6421FD35" id="Text Box 11" o:spid="_x0000_s1034" type="#_x0000_t202" style="width:462pt;height:162pt;visibility:visible;mso-wrap-style:square;mso-left-percent:-10001;mso-top-percent:-10001;mso-position-horizontal:absolute;mso-position-horizontal-relative:char;mso-position-vertical:absolute;mso-position-vertical-relative:line;mso-left-percent:-10001;mso-top-percent:-10001;v-text-anchor:top" o:gfxdata="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" fillcolor="white [3201]" strokeweight=".5pt">
                 <v:textbox>
@@ -10718,7 +11726,29 @@
                                 <w:szCs w:val="20"/>
                                 <w14:ligatures w14:val="none"/>
                               </w:rPr>
-                              <w:t>#include &lt;iostream&gt;</w:t>
+                              <w:t>#include &lt;</w:t>
+                            </w:r>
+                            <w:proofErr w:type="spellStart"/>
+                            <w:r>
+                              <w:rPr>
+                                <w:rFonts w:ascii="Consolas" w:eastAsia="Times New Roman" w:hAnsi="Consolas" w:cs="Courier New"/>
+                                <w:kern w:val="0"/>
+                                <w:sz w:val="20"/>
+                                <w:szCs w:val="20"/>
+                                <w14:ligatures w14:val="none"/>
+                              </w:rPr>
+                              <w:t>iostream</w:t>
+                            </w:r>
+                            <w:proofErr w:type="spellEnd"/>
+                            <w:r>
+                              <w:rPr>
+                                <w:rFonts w:ascii="Consolas" w:eastAsia="Times New Roman" w:hAnsi="Consolas" w:cs="Courier New"/>
+                                <w:kern w:val="0"/>
+                                <w:sz w:val="20"/>
+                                <w:szCs w:val="20"/>
+                                <w14:ligatures w14:val="none"/>
+                              </w:rPr>
+                              <w:t>&gt;</w:t>
                             </w:r>
                           </w:p>
                           <w:p>
@@ -10759,7 +11789,29 @@
                                 <w:szCs w:val="20"/>
                                 <w14:ligatures w14:val="none"/>
                               </w:rPr>
-                              <w:t>using namespace std;</w:t>
+                              <w:t xml:space="preserve">using namespace </w:t>
+                            </w:r>
+                            <w:proofErr w:type="spellStart"/>
+                            <w:r>
+                              <w:rPr>
+                                <w:rFonts w:ascii="Consolas" w:eastAsia="Times New Roman" w:hAnsi="Consolas" w:cs="Courier New"/>
+                                <w:kern w:val="0"/>
+                                <w:sz w:val="20"/>
+                                <w:szCs w:val="20"/>
+                                <w14:ligatures w14:val="none"/>
+                              </w:rPr>
+                              <w:t>std</w:t>
+                            </w:r>
+                            <w:proofErr w:type="spellEnd"/>
+                            <w:r>
+                              <w:rPr>
+                                <w:rFonts w:ascii="Consolas" w:eastAsia="Times New Roman" w:hAnsi="Consolas" w:cs="Courier New"/>
+                                <w:kern w:val="0"/>
+                                <w:sz w:val="20"/>
+                                <w:szCs w:val="20"/>
+                                <w14:ligatures w14:val="none"/>
+                              </w:rPr>
+                              <w:t>;</w:t>
                             </w:r>
                           </w:p>
                           <w:p>
@@ -10958,7 +12010,29 @@
                                 <w:szCs w:val="20"/>
                                 <w14:ligatures w14:val="none"/>
                               </w:rPr>
-                              <w:t>void info() {</w:t>
+                              <w:t xml:space="preserve">void </w:t>
+                            </w:r>
+                            <w:proofErr w:type="gramStart"/>
+                            <w:r>
+                              <w:rPr>
+                                <w:rFonts w:ascii="Consolas" w:eastAsia="Times New Roman" w:hAnsi="Consolas" w:cs="Courier New"/>
+                                <w:kern w:val="0"/>
+                                <w:sz w:val="20"/>
+                                <w:szCs w:val="20"/>
+                                <w14:ligatures w14:val="none"/>
+                              </w:rPr>
+                              <w:t>info(</w:t>
+                            </w:r>
+                            <w:proofErr w:type="gramEnd"/>
+                            <w:r>
+                              <w:rPr>
+                                <w:rFonts w:ascii="Consolas" w:eastAsia="Times New Roman" w:hAnsi="Consolas" w:cs="Courier New"/>
+                                <w:kern w:val="0"/>
+                                <w:sz w:val="20"/>
+                                <w:szCs w:val="20"/>
+                                <w14:ligatures w14:val="none"/>
+                              </w:rPr>
+                              <w:t>) {</w:t>
                             </w:r>
                           </w:p>
                           <w:p>
@@ -11401,7 +12475,29 @@
                                 <w:szCs w:val="20"/>
                                 <w14:ligatures w14:val="none"/>
                               </w:rPr>
-                              <w:t>void show() {</w:t>
+                              <w:t xml:space="preserve">void </w:t>
+                            </w:r>
+                            <w:proofErr w:type="gramStart"/>
+                            <w:r>
+                              <w:rPr>
+                                <w:rFonts w:ascii="Consolas" w:eastAsia="Times New Roman" w:hAnsi="Consolas" w:cs="Courier New"/>
+                                <w:kern w:val="0"/>
+                                <w:sz w:val="20"/>
+                                <w:szCs w:val="20"/>
+                                <w14:ligatures w14:val="none"/>
+                              </w:rPr>
+                              <w:t>show(</w:t>
+                            </w:r>
+                            <w:proofErr w:type="gramEnd"/>
+                            <w:r>
+                              <w:rPr>
+                                <w:rFonts w:ascii="Consolas" w:eastAsia="Times New Roman" w:hAnsi="Consolas" w:cs="Courier New"/>
+                                <w:kern w:val="0"/>
+                                <w:sz w:val="20"/>
+                                <w:szCs w:val="20"/>
+                                <w14:ligatures w14:val="none"/>
+                              </w:rPr>
+                              <w:t>) {</w:t>
                             </w:r>
                           </w:p>
                           <w:p>
@@ -11444,7 +12540,29 @@
                                 <w:szCs w:val="20"/>
                                 <w14:ligatures w14:val="none"/>
                               </w:rPr>
-                              <w:t xml:space="preserve">p.info(); </w:t>
+                              <w:t>p.</w:t>
+                            </w:r>
+                            <w:proofErr w:type="gramStart"/>
+                            <w:r>
+                              <w:rPr>
+                                <w:rFonts w:ascii="Consolas" w:eastAsia="Times New Roman" w:hAnsi="Consolas" w:cs="Courier New"/>
+                                <w:kern w:val="0"/>
+                                <w:sz w:val="20"/>
+                                <w:szCs w:val="20"/>
+                                <w14:ligatures w14:val="none"/>
+                              </w:rPr>
+                              <w:t>info(</w:t>
+                            </w:r>
+                            <w:proofErr w:type="gramEnd"/>
+                            <w:r>
+                              <w:rPr>
+                                <w:rFonts w:ascii="Consolas" w:eastAsia="Times New Roman" w:hAnsi="Consolas" w:cs="Courier New"/>
+                                <w:kern w:val="0"/>
+                                <w:sz w:val="20"/>
+                                <w:szCs w:val="20"/>
+                                <w14:ligatures w14:val="none"/>
+                              </w:rPr>
+                              <w:t xml:space="preserve">); </w:t>
                             </w:r>
                             <w:r>
                               <w:rPr>
@@ -11602,15 +12720,49 @@
                                 <w14:ligatures w14:val="none"/>
                               </w:rPr>
                             </w:pPr>
-                            <w:r>
-                              <w:rPr>
-                                <w:rFonts w:ascii="Consolas" w:eastAsia="Times New Roman" w:hAnsi="Consolas" w:cs="Courier New"/>
-                                <w:kern w:val="0"/>
-                                <w:sz w:val="20"/>
-                                <w:szCs w:val="20"/>
-                                <w14:ligatures w14:val="none"/>
-                              </w:rPr>
-                              <w:t>int main() {</w:t>
+                            <w:proofErr w:type="spellStart"/>
+                            <w:r>
+                              <w:rPr>
+                                <w:rFonts w:ascii="Consolas" w:eastAsia="Times New Roman" w:hAnsi="Consolas" w:cs="Courier New"/>
+                                <w:kern w:val="0"/>
+                                <w:sz w:val="20"/>
+                                <w:szCs w:val="20"/>
+                                <w14:ligatures w14:val="none"/>
+                              </w:rPr>
+                              <w:t>int</w:t>
+                            </w:r>
+                            <w:proofErr w:type="spellEnd"/>
+                            <w:r>
+                              <w:rPr>
+                                <w:rFonts w:ascii="Consolas" w:eastAsia="Times New Roman" w:hAnsi="Consolas" w:cs="Courier New"/>
+                                <w:kern w:val="0"/>
+                                <w:sz w:val="20"/>
+                                <w:szCs w:val="20"/>
+                                <w14:ligatures w14:val="none"/>
+                              </w:rPr>
+                              <w:t xml:space="preserve"> </w:t>
+                            </w:r>
+                            <w:proofErr w:type="gramStart"/>
+                            <w:r>
+                              <w:rPr>
+                                <w:rFonts w:ascii="Consolas" w:eastAsia="Times New Roman" w:hAnsi="Consolas" w:cs="Courier New"/>
+                                <w:kern w:val="0"/>
+                                <w:sz w:val="20"/>
+                                <w:szCs w:val="20"/>
+                                <w14:ligatures w14:val="none"/>
+                              </w:rPr>
+                              <w:t>main(</w:t>
+                            </w:r>
+                            <w:proofErr w:type="gramEnd"/>
+                            <w:r>
+                              <w:rPr>
+                                <w:rFonts w:ascii="Consolas" w:eastAsia="Times New Roman" w:hAnsi="Consolas" w:cs="Courier New"/>
+                                <w:kern w:val="0"/>
+                                <w:sz w:val="20"/>
+                                <w:szCs w:val="20"/>
+                                <w14:ligatures w14:val="none"/>
+                              </w:rPr>
+                              <w:t>) {</w:t>
                             </w:r>
                           </w:p>
                           <w:p>
@@ -11696,15 +12848,49 @@
                                 <w14:ligatures w14:val="none"/>
                               </w:rPr>
                             </w:pPr>
-                            <w:r>
-                              <w:rPr>
-                                <w:rFonts w:ascii="Consolas" w:eastAsia="Times New Roman" w:hAnsi="Consolas" w:cs="Courier New"/>
-                                <w:kern w:val="0"/>
-                                <w:sz w:val="20"/>
-                                <w:szCs w:val="20"/>
-                                <w14:ligatures w14:val="none"/>
-                              </w:rPr>
-                              <w:t>c.show();</w:t>
+                            <w:proofErr w:type="spellStart"/>
+                            <w:r>
+                              <w:rPr>
+                                <w:rFonts w:ascii="Consolas" w:eastAsia="Times New Roman" w:hAnsi="Consolas" w:cs="Courier New"/>
+                                <w:kern w:val="0"/>
+                                <w:sz w:val="20"/>
+                                <w:szCs w:val="20"/>
+                                <w14:ligatures w14:val="none"/>
+                              </w:rPr>
+                              <w:t>c.</w:t>
+                            </w:r>
+                            <w:proofErr w:type="gramStart"/>
+                            <w:r>
+                              <w:rPr>
+                                <w:rFonts w:ascii="Consolas" w:eastAsia="Times New Roman" w:hAnsi="Consolas" w:cs="Courier New"/>
+                                <w:kern w:val="0"/>
+                                <w:sz w:val="20"/>
+                                <w:szCs w:val="20"/>
+                                <w14:ligatures w14:val="none"/>
+                              </w:rPr>
+                              <w:t>show</w:t>
+                            </w:r>
+                            <w:proofErr w:type="spellEnd"/>
+                            <w:r>
+                              <w:rPr>
+                                <w:rFonts w:ascii="Consolas" w:eastAsia="Times New Roman" w:hAnsi="Consolas" w:cs="Courier New"/>
+                                <w:kern w:val="0"/>
+                                <w:sz w:val="20"/>
+                                <w:szCs w:val="20"/>
+                                <w14:ligatures w14:val="none"/>
+                              </w:rPr>
+                              <w:t>(</w:t>
+                            </w:r>
+                            <w:proofErr w:type="gramEnd"/>
+                            <w:r>
+                              <w:rPr>
+                                <w:rFonts w:ascii="Consolas" w:eastAsia="Times New Roman" w:hAnsi="Consolas" w:cs="Courier New"/>
+                                <w:kern w:val="0"/>
+                                <w:sz w:val="20"/>
+                                <w:szCs w:val="20"/>
+                                <w14:ligatures w14:val="none"/>
+                              </w:rPr>
+                              <w:t>);</w:t>
                             </w:r>
                           </w:p>
                           <w:p>
@@ -11804,7 +12990,7 @@
               </wp:inline>
             </w:drawing>
           </mc:Choice>
-          <mc:Fallback>
+          <mc:Fallback xmlns:w16sdtfl="http://schemas.microsoft.com/office/word/2024/wordml/sdtformatlock" xmlns:w16sdtdh="http://schemas.microsoft.com/office/word/2020/wordml/sdtdatahash" xmlns:w16du="http://schemas.microsoft.com/office/word/2023/wordml/word16du" xmlns:w16="http://schemas.microsoft.com/office/word/2018/wordml" xmlns:w16cid="http://schemas.microsoft.com/office/word/2016/wordml/cid" xmlns:w16cex="http://schemas.microsoft.com/office/word/2018/wordml/cex" xmlns:w16cei="http://schemas.microsoft.com/office/word/2026/wordml/cei" xmlns:oel="http://schemas.microsoft.com/office/2019/extlst" xmlns:am3d="http://schemas.microsoft.com/office/drawing/2017/model3d" xmlns:aink="http://schemas.microsoft.com/office/drawing/2016/ink" xmlns:cx8="http://schemas.microsoft.com/office/drawing/2016/5/14/chartex" xmlns:cx7="http://schemas.microsoft.com/office/drawing/2016/5/13/chartex" xmlns:cx6="http://schemas.microsoft.com/office/drawing/2016/5/12/chartex" xmlns:cx5="http://schemas.microsoft.com/office/drawing/2016/5/11/chartex" xmlns:cx4="http://schemas.microsoft.com/office/drawing/2016/5/10/chartex" xmlns:cx3="http://schemas.microsoft.com/office/drawing/2016/5/9/chartex" xmlns:cx2="http://schemas.microsoft.com/office/drawing/2015/10/21/chartex" xmlns:cx1="http://schemas.microsoft.com/office/drawing/2015/9/8/chartex">
             <w:pict>
               <v:shape w14:anchorId="67282DB8" id="Text Box 7" o:spid="_x0000_s1035" type="#_x0000_t202" style="width:460.5pt;height:330pt;visibility:visible;mso-wrap-style:square;mso-left-percent:-10001;mso-top-percent:-10001;mso-position-horizontal:absolute;mso-position-horizontal-relative:char;mso-position-vertical:absolute;mso-position-vertical-relative:line;mso-left-percent:-10001;mso-top-percent:-10001;v-text-anchor:top" o:gfxdata="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" fillcolor="white [3201]" strokeweight=".5pt">
                 <v:textbox>
@@ -13094,7 +14280,29 @@
                                 <w:szCs w:val="20"/>
                                 <w14:ligatures w14:val="none"/>
                               </w:rPr>
-                              <w:t>#include &lt;iostream&gt;</w:t>
+                              <w:t>#include &lt;</w:t>
+                            </w:r>
+                            <w:proofErr w:type="spellStart"/>
+                            <w:r>
+                              <w:rPr>
+                                <w:rFonts w:ascii="Consolas" w:eastAsia="Times New Roman" w:hAnsi="Consolas" w:cs="Courier New"/>
+                                <w:kern w:val="0"/>
+                                <w:sz w:val="20"/>
+                                <w:szCs w:val="20"/>
+                                <w14:ligatures w14:val="none"/>
+                              </w:rPr>
+                              <w:t>iostream</w:t>
+                            </w:r>
+                            <w:proofErr w:type="spellEnd"/>
+                            <w:r>
+                              <w:rPr>
+                                <w:rFonts w:ascii="Consolas" w:eastAsia="Times New Roman" w:hAnsi="Consolas" w:cs="Courier New"/>
+                                <w:kern w:val="0"/>
+                                <w:sz w:val="20"/>
+                                <w:szCs w:val="20"/>
+                                <w14:ligatures w14:val="none"/>
+                              </w:rPr>
+                              <w:t>&gt;</w:t>
                             </w:r>
                           </w:p>
                           <w:p>
@@ -13135,7 +14343,29 @@
                                 <w:szCs w:val="20"/>
                                 <w14:ligatures w14:val="none"/>
                               </w:rPr>
-                              <w:t>using namespace std;</w:t>
+                              <w:t xml:space="preserve">using namespace </w:t>
+                            </w:r>
+                            <w:proofErr w:type="spellStart"/>
+                            <w:r>
+                              <w:rPr>
+                                <w:rFonts w:ascii="Consolas" w:eastAsia="Times New Roman" w:hAnsi="Consolas" w:cs="Courier New"/>
+                                <w:kern w:val="0"/>
+                                <w:sz w:val="20"/>
+                                <w:szCs w:val="20"/>
+                                <w14:ligatures w14:val="none"/>
+                              </w:rPr>
+                              <w:t>std</w:t>
+                            </w:r>
+                            <w:proofErr w:type="spellEnd"/>
+                            <w:r>
+                              <w:rPr>
+                                <w:rFonts w:ascii="Consolas" w:eastAsia="Times New Roman" w:hAnsi="Consolas" w:cs="Courier New"/>
+                                <w:kern w:val="0"/>
+                                <w:sz w:val="20"/>
+                                <w:szCs w:val="20"/>
+                                <w14:ligatures w14:val="none"/>
+                              </w:rPr>
+                              <w:t>;</w:t>
                             </w:r>
                           </w:p>
                           <w:p>
@@ -13334,7 +14564,29 @@
                                 <w:szCs w:val="20"/>
                                 <w14:ligatures w14:val="none"/>
                               </w:rPr>
-                              <w:t>void open() {</w:t>
+                              <w:t xml:space="preserve">void </w:t>
+                            </w:r>
+                            <w:proofErr w:type="gramStart"/>
+                            <w:r>
+                              <w:rPr>
+                                <w:rFonts w:ascii="Consolas" w:eastAsia="Times New Roman" w:hAnsi="Consolas" w:cs="Courier New"/>
+                                <w:kern w:val="0"/>
+                                <w:sz w:val="20"/>
+                                <w:szCs w:val="20"/>
+                                <w14:ligatures w14:val="none"/>
+                              </w:rPr>
+                              <w:t>open(</w:t>
+                            </w:r>
+                            <w:proofErr w:type="gramEnd"/>
+                            <w:r>
+                              <w:rPr>
+                                <w:rFonts w:ascii="Consolas" w:eastAsia="Times New Roman" w:hAnsi="Consolas" w:cs="Courier New"/>
+                                <w:kern w:val="0"/>
+                                <w:sz w:val="20"/>
+                                <w:szCs w:val="20"/>
+                                <w14:ligatures w14:val="none"/>
+                              </w:rPr>
+                              <w:t>) {</w:t>
                             </w:r>
                           </w:p>
                           <w:p>
@@ -13656,7 +14908,29 @@
                                 <w:szCs w:val="20"/>
                                 <w14:ligatures w14:val="none"/>
                               </w:rPr>
-                              <w:t>void edit(File f) {</w:t>
+                              <w:t xml:space="preserve">void </w:t>
+                            </w:r>
+                            <w:proofErr w:type="gramStart"/>
+                            <w:r>
+                              <w:rPr>
+                                <w:rFonts w:ascii="Consolas" w:eastAsia="Times New Roman" w:hAnsi="Consolas" w:cs="Courier New"/>
+                                <w:kern w:val="0"/>
+                                <w:sz w:val="20"/>
+                                <w:szCs w:val="20"/>
+                                <w14:ligatures w14:val="none"/>
+                              </w:rPr>
+                              <w:t>edit(</w:t>
+                            </w:r>
+                            <w:proofErr w:type="gramEnd"/>
+                            <w:r>
+                              <w:rPr>
+                                <w:rFonts w:ascii="Consolas" w:eastAsia="Times New Roman" w:hAnsi="Consolas" w:cs="Courier New"/>
+                                <w:kern w:val="0"/>
+                                <w:sz w:val="20"/>
+                                <w:szCs w:val="20"/>
+                                <w14:ligatures w14:val="none"/>
+                              </w:rPr>
+                              <w:t>File f) {</w:t>
                             </w:r>
                           </w:p>
                           <w:p>
@@ -13689,15 +14963,29 @@
                                 <w14:ligatures w14:val="none"/>
                               </w:rPr>
                             </w:pPr>
-                            <w:r>
-                              <w:rPr>
-                                <w:rFonts w:ascii="Consolas" w:eastAsia="Times New Roman" w:hAnsi="Consolas" w:cs="Courier New"/>
-                                <w:kern w:val="0"/>
-                                <w:sz w:val="20"/>
-                                <w:szCs w:val="20"/>
-                                <w14:ligatures w14:val="none"/>
-                              </w:rPr>
-                              <w:t>f.open();</w:t>
+                            <w:proofErr w:type="spellStart"/>
+                            <w:proofErr w:type="gramStart"/>
+                            <w:r>
+                              <w:rPr>
+                                <w:rFonts w:ascii="Consolas" w:eastAsia="Times New Roman" w:hAnsi="Consolas" w:cs="Courier New"/>
+                                <w:kern w:val="0"/>
+                                <w:sz w:val="20"/>
+                                <w:szCs w:val="20"/>
+                                <w14:ligatures w14:val="none"/>
+                              </w:rPr>
+                              <w:t>f.open</w:t>
+                            </w:r>
+                            <w:proofErr w:type="spellEnd"/>
+                            <w:proofErr w:type="gramEnd"/>
+                            <w:r>
+                              <w:rPr>
+                                <w:rFonts w:ascii="Consolas" w:eastAsia="Times New Roman" w:hAnsi="Consolas" w:cs="Courier New"/>
+                                <w:kern w:val="0"/>
+                                <w:sz w:val="20"/>
+                                <w:szCs w:val="20"/>
+                                <w14:ligatures w14:val="none"/>
+                              </w:rPr>
+                              <w:t>();</w:t>
                             </w:r>
                           </w:p>
                           <w:p>
@@ -13884,15 +15172,49 @@
                                 <w14:ligatures w14:val="none"/>
                               </w:rPr>
                             </w:pPr>
-                            <w:r>
-                              <w:rPr>
-                                <w:rFonts w:ascii="Consolas" w:eastAsia="Times New Roman" w:hAnsi="Consolas" w:cs="Courier New"/>
-                                <w:kern w:val="0"/>
-                                <w:sz w:val="20"/>
-                                <w:szCs w:val="20"/>
-                                <w14:ligatures w14:val="none"/>
-                              </w:rPr>
-                              <w:t>int main() {</w:t>
+                            <w:proofErr w:type="spellStart"/>
+                            <w:r>
+                              <w:rPr>
+                                <w:rFonts w:ascii="Consolas" w:eastAsia="Times New Roman" w:hAnsi="Consolas" w:cs="Courier New"/>
+                                <w:kern w:val="0"/>
+                                <w:sz w:val="20"/>
+                                <w:szCs w:val="20"/>
+                                <w14:ligatures w14:val="none"/>
+                              </w:rPr>
+                              <w:t>int</w:t>
+                            </w:r>
+                            <w:proofErr w:type="spellEnd"/>
+                            <w:r>
+                              <w:rPr>
+                                <w:rFonts w:ascii="Consolas" w:eastAsia="Times New Roman" w:hAnsi="Consolas" w:cs="Courier New"/>
+                                <w:kern w:val="0"/>
+                                <w:sz w:val="20"/>
+                                <w:szCs w:val="20"/>
+                                <w14:ligatures w14:val="none"/>
+                              </w:rPr>
+                              <w:t xml:space="preserve"> </w:t>
+                            </w:r>
+                            <w:proofErr w:type="gramStart"/>
+                            <w:r>
+                              <w:rPr>
+                                <w:rFonts w:ascii="Consolas" w:eastAsia="Times New Roman" w:hAnsi="Consolas" w:cs="Courier New"/>
+                                <w:kern w:val="0"/>
+                                <w:sz w:val="20"/>
+                                <w:szCs w:val="20"/>
+                                <w14:ligatures w14:val="none"/>
+                              </w:rPr>
+                              <w:t>main(</w:t>
+                            </w:r>
+                            <w:proofErr w:type="gramEnd"/>
+                            <w:r>
+                              <w:rPr>
+                                <w:rFonts w:ascii="Consolas" w:eastAsia="Times New Roman" w:hAnsi="Consolas" w:cs="Courier New"/>
+                                <w:kern w:val="0"/>
+                                <w:sz w:val="20"/>
+                                <w:szCs w:val="20"/>
+                                <w14:ligatures w14:val="none"/>
+                              </w:rPr>
+                              <w:t>) {</w:t>
                             </w:r>
                           </w:p>
                           <w:p>
@@ -14062,15 +15384,29 @@
                                 <w14:ligatures w14:val="none"/>
                               </w:rPr>
                             </w:pPr>
-                            <w:r>
-                              <w:rPr>
-                                <w:rFonts w:ascii="Consolas" w:eastAsia="Times New Roman" w:hAnsi="Consolas" w:cs="Courier New"/>
-                                <w:kern w:val="0"/>
-                                <w:sz w:val="20"/>
-                                <w:szCs w:val="20"/>
-                                <w14:ligatures w14:val="none"/>
-                              </w:rPr>
-                              <w:t xml:space="preserve">e.edit(f); </w:t>
+                            <w:proofErr w:type="spellStart"/>
+                            <w:proofErr w:type="gramStart"/>
+                            <w:r>
+                              <w:rPr>
+                                <w:rFonts w:ascii="Consolas" w:eastAsia="Times New Roman" w:hAnsi="Consolas" w:cs="Courier New"/>
+                                <w:kern w:val="0"/>
+                                <w:sz w:val="20"/>
+                                <w:szCs w:val="20"/>
+                                <w14:ligatures w14:val="none"/>
+                              </w:rPr>
+                              <w:t>e.edit</w:t>
+                            </w:r>
+                            <w:proofErr w:type="spellEnd"/>
+                            <w:proofErr w:type="gramEnd"/>
+                            <w:r>
+                              <w:rPr>
+                                <w:rFonts w:ascii="Consolas" w:eastAsia="Times New Roman" w:hAnsi="Consolas" w:cs="Courier New"/>
+                                <w:kern w:val="0"/>
+                                <w:sz w:val="20"/>
+                                <w:szCs w:val="20"/>
+                                <w14:ligatures w14:val="none"/>
+                              </w:rPr>
+                              <w:t xml:space="preserve">(f); </w:t>
                             </w:r>
                             <w:r>
                               <w:rPr>
@@ -14182,7 +15518,7 @@
               </wp:inline>
             </w:drawing>
           </mc:Choice>
-          <mc:Fallback>
+          <mc:Fallback xmlns:w16sdtfl="http://schemas.microsoft.com/office/word/2024/wordml/sdtformatlock" xmlns:w16sdtdh="http://schemas.microsoft.com/office/word/2020/wordml/sdtdatahash" xmlns:w16du="http://schemas.microsoft.com/office/word/2023/wordml/word16du" xmlns:w16="http://schemas.microsoft.com/office/word/2018/wordml" xmlns:w16cid="http://schemas.microsoft.com/office/word/2016/wordml/cid" xmlns:w16cex="http://schemas.microsoft.com/office/word/2018/wordml/cex" xmlns:w16cei="http://schemas.microsoft.com/office/word/2026/wordml/cei" xmlns:oel="http://schemas.microsoft.com/office/2019/extlst" xmlns:am3d="http://schemas.microsoft.com/office/drawing/2017/model3d" xmlns:aink="http://schemas.microsoft.com/office/drawing/2016/ink" xmlns:cx8="http://schemas.microsoft.com/office/drawing/2016/5/14/chartex" xmlns:cx7="http://schemas.microsoft.com/office/drawing/2016/5/13/chartex" xmlns:cx6="http://schemas.microsoft.com/office/drawing/2016/5/12/chartex" xmlns:cx5="http://schemas.microsoft.com/office/drawing/2016/5/11/chartex" xmlns:cx4="http://schemas.microsoft.com/office/drawing/2016/5/10/chartex" xmlns:cx3="http://schemas.microsoft.com/office/drawing/2016/5/9/chartex" xmlns:cx2="http://schemas.microsoft.com/office/drawing/2015/10/21/chartex" xmlns:cx1="http://schemas.microsoft.com/office/drawing/2015/9/8/chartex">
             <w:pict>
               <v:shape w14:anchorId="1CF2612B" id="Text Box 6" o:spid="_x0000_s1036" type="#_x0000_t202" style="width:460.5pt;height:328pt;visibility:visible;mso-wrap-style:square;mso-left-percent:-10001;mso-top-percent:-10001;mso-position-horizontal:absolute;mso-position-horizontal-relative:char;mso-position-vertical:absolute;mso-position-vertical-relative:line;mso-left-percent:-10001;mso-top-percent:-10001;v-text-anchor:top" o:gfxdata="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" fillcolor="white [3201]" strokeweight=".5pt">
                 <v:textbox>
@@ -15598,6 +16934,8 @@
         </w:rPr>
         <w:t>Getter functions to access book details</w:t>
       </w:r>
+      <w:bookmarkStart w:id="0" w:name="_GoBack"/>
+      <w:bookmarkEnd w:id="0"/>
     </w:p>
     <w:p>
       <w:pPr>
@@ -15619,7 +16957,25 @@
           <w:kern w:val="0"/>
           <w14:ligatures w14:val="none"/>
         </w:rPr>
-        <w:t>In main():</w:t>
+        <w:t xml:space="preserve">In </w:t>
+      </w:r>
+      <w:proofErr w:type="gramStart"/>
+      <w:r>
+        <w:rPr>
+          <w:rFonts w:ascii="Times New Roman" w:eastAsia="Times New Roman" w:hAnsi="Times New Roman" w:cs="Times New Roman"/>
+          <w:kern w:val="0"/>
+          <w14:ligatures w14:val="none"/>
+        </w:rPr>
+        <w:t>main(</w:t>
+      </w:r>
+      <w:proofErr w:type="gramEnd"/>
+      <w:r>
+        <w:rPr>
+          <w:rFonts w:ascii="Times New Roman" w:eastAsia="Times New Roman" w:hAnsi="Times New Roman" w:cs="Times New Roman"/>
+          <w:kern w:val="0"/>
+          <w14:ligatures w14:val="none"/>
+        </w:rPr>
+        <w:t>):</w:t>
       </w:r>
     </w:p>
     <w:p>
@@ -16019,7 +17375,25 @@
           <w:kern w:val="0"/>
           <w14:ligatures w14:val="none"/>
         </w:rPr>
-        <w:t>In main():</w:t>
+        <w:t xml:space="preserve">In </w:t>
+      </w:r>
+      <w:proofErr w:type="gramStart"/>
+      <w:r>
+        <w:rPr>
+          <w:rFonts w:ascii="Times New Roman" w:eastAsia="Times New Roman" w:hAnsi="Times New Roman" w:cs="Times New Roman"/>
+          <w:kern w:val="0"/>
+          <w14:ligatures w14:val="none"/>
+        </w:rPr>
+        <w:t>main(</w:t>
+      </w:r>
+      <w:proofErr w:type="gramEnd"/>
+      <w:r>
+        <w:rPr>
+          <w:rFonts w:ascii="Times New Roman" w:eastAsia="Times New Roman" w:hAnsi="Times New Roman" w:cs="Times New Roman"/>
+          <w:kern w:val="0"/>
+          <w14:ligatures w14:val="none"/>
+        </w:rPr>
+        <w:t>):</w:t>
       </w:r>
     </w:p>
     <w:p>
@@ -16295,7 +17669,25 @@
           <w:kern w:val="0"/>
           <w14:ligatures w14:val="none"/>
         </w:rPr>
-        <w:t>In main():</w:t>
+        <w:t xml:space="preserve">In </w:t>
+      </w:r>
+      <w:proofErr w:type="gramStart"/>
+      <w:r>
+        <w:rPr>
+          <w:rFonts w:ascii="Times New Roman" w:eastAsia="Times New Roman" w:hAnsi="Times New Roman" w:cs="Times New Roman"/>
+          <w:kern w:val="0"/>
+          <w14:ligatures w14:val="none"/>
+        </w:rPr>
+        <w:t>main(</w:t>
+      </w:r>
+      <w:proofErr w:type="gramEnd"/>
+      <w:r>
+        <w:rPr>
+          <w:rFonts w:ascii="Times New Roman" w:eastAsia="Times New Roman" w:hAnsi="Times New Roman" w:cs="Times New Roman"/>
+          <w:kern w:val="0"/>
+          <w14:ligatures w14:val="none"/>
+        </w:rPr>
+        <w:t>):</w:t>
       </w:r>
     </w:p>
     <w:p>
@@ -16549,7 +17941,7 @@
 </file>
 
 <file path=word/endnotes.xml><?xml version="1.0" encoding="utf-8"?>
-<w:endnotes xmlns:wpc="http://schemas.microsoft.com/office/word/2010/wordprocessingCanvas" xmlns:cx="http://schemas.microsoft.com/office/drawing/2014/chartex" xmlns:cx1="http://schemas.microsoft.com/office/drawing/2015/9/8/chartex" xmlns:cx2="http://schemas.microsoft.com/office/drawing/2015/10/21/chartex" xmlns:cx3="http://schemas.microsoft.com/office/drawing/2016/5/9/chartex" xmlns:cx4="http://schemas.microsoft.com/office/drawing/2016/5/10/chartex" xmlns:cx5="http://schemas.microsoft.com/office/drawing/2016/5/11/chartex" xmlns:cx6="http://schemas.microsoft.com/office/drawing/2016/5/12/chartex" xmlns:cx7="http://schemas.microsoft.com/office/drawing/2016/5/13/chartex" xmlns:cx8="http://schemas.microsoft.com/office/drawing/2016/5/14/chartex" xmlns:mc="http://schemas.openxmlformats.org/markup-compatibility/2006" xmlns:aink="http://schemas.microsoft.com/office/drawing/2016/ink" xmlns:am3d="http://schemas.microsoft.com/office/drawing/2017/model3d" xmlns:o="urn:schemas-microsoft-com:office:office" xmlns:oel="http://schemas.microsoft.com/office/2019/extlst" xmlns:r="http://schemas.openxmlformats.org/officeDocument/2006/relationships" xmlns:m="http://schemas.openxmlformats.org/officeDocument/2006/math" xmlns:v="urn:schemas-microsoft-com:vml" xmlns:wp14="http://schemas.microsoft.com/office/word/2010/wordprocessingDrawing" xmlns:wp="http://schemas.openxmlformats.org/drawingml/2006/wordprocessingDrawing" xmlns:w10="urn:schemas-microsoft-com:office:word" xmlns:w="http://schemas.openxmlformats.org/wordprocessingml/2006/main" xmlns:w14="http://schemas.microsoft.com/office/word/2010/wordml" xmlns:w15="http://schemas.microsoft.com/office/word/2012/wordml" xmlns:w16cei="http://schemas.microsoft.com/office/word/2026/wordml/cei" xmlns:w16cex="http://schemas.microsoft.com/office/word/2018/wordml/cex" xmlns:w16cid="http://schemas.microsoft.com/office/word/2016/wordml/cid" xmlns:w16="http://schemas.microsoft.com/office/word/2018/wordml" xmlns:w16du="http://schemas.microsoft.com/office/word/2023/wordml/word16du" xmlns:w16sdtdh="http://schemas.microsoft.com/office/word/2020/wordml/sdtdatahash" xmlns:w16sdtfl="http://schemas.microsoft.com/office/word/2024/wordml/sdtformatlock" xmlns:w16se="http://schemas.microsoft.com/office/word/2015/wordml/symex" xmlns:wpg="http://schemas.microsoft.com/office/word/2010/wordprocessingGroup" xmlns:wpi="http://schemas.microsoft.com/office/word/2010/wordprocessingInk" xmlns:wne="http://schemas.microsoft.com/office/word/2006/wordml" xmlns:wps="http://schemas.microsoft.com/office/word/2010/wordprocessingShape" mc:Ignorable="w14 w15 w16se w16cid w16 w16cex w16sdtdh w16sdtfl w16du wp14">
+<w:endnotes xmlns:wpc="http://schemas.microsoft.com/office/word/2010/wordprocessingCanvas" xmlns:cx="http://schemas.microsoft.com/office/drawing/2014/chartex" xmlns:mc="http://schemas.openxmlformats.org/markup-compatibility/2006" xmlns:o="urn:schemas-microsoft-com:office:office" xmlns:r="http://schemas.openxmlformats.org/officeDocument/2006/relationships" xmlns:m="http://schemas.openxmlformats.org/officeDocument/2006/math" xmlns:v="urn:schemas-microsoft-com:vml" xmlns:wp14="http://schemas.microsoft.com/office/word/2010/wordprocessingDrawing" xmlns:wp="http://schemas.openxmlformats.org/drawingml/2006/wordprocessingDrawing" xmlns:w10="urn:schemas-microsoft-com:office:word" xmlns:w="http://schemas.openxmlformats.org/wordprocessingml/2006/main" xmlns:w14="http://schemas.microsoft.com/office/word/2010/wordml" xmlns:w15="http://schemas.microsoft.com/office/word/2012/wordml" xmlns:w16se="http://schemas.microsoft.com/office/word/2015/wordml/symex" xmlns:wpg="http://schemas.microsoft.com/office/word/2010/wordprocessingGroup" xmlns:wpi="http://schemas.microsoft.com/office/word/2010/wordprocessingInk" xmlns:wne="http://schemas.microsoft.com/office/word/2006/wordml" xmlns:wps="http://schemas.microsoft.com/office/word/2010/wordprocessingShape" mc:Ignorable="w14 w15 w16se wp14">
   <w:endnote w:type="separator" w:id="-1">
     <w:p>
       <w:pPr>
@@ -16574,7 +17966,7 @@
 </file>
 
 <file path=word/footer1.xml><?xml version="1.0" encoding="utf-8"?>
-<w:ftr xmlns:wpc="http://schemas.microsoft.com/office/word/2010/wordprocessingCanvas" xmlns:cx="http://schemas.microsoft.com/office/drawing/2014/chartex" xmlns:cx1="http://schemas.microsoft.com/office/drawing/2015/9/8/chartex" xmlns:cx2="http://schemas.microsoft.com/office/drawing/2015/10/21/chartex" xmlns:cx3="http://schemas.microsoft.com/office/drawing/2016/5/9/chartex" xmlns:cx4="http://schemas.microsoft.com/office/drawing/2016/5/10/chartex" xmlns:cx5="http://schemas.microsoft.com/office/drawing/2016/5/11/chartex" xmlns:cx6="http://schemas.microsoft.com/office/drawing/2016/5/12/chartex" xmlns:cx7="http://schemas.microsoft.com/office/drawing/2016/5/13/chartex" xmlns:cx8="http://schemas.microsoft.com/office/drawing/2016/5/14/chartex" xmlns:mc="http://schemas.openxmlformats.org/markup-compatibility/2006" xmlns:aink="http://schemas.microsoft.com/office/drawing/2016/ink" xmlns:am3d="http://schemas.microsoft.com/office/drawing/2017/model3d" xmlns:o="urn:schemas-microsoft-com:office:office" xmlns:oel="http://schemas.microsoft.com/office/2019/extlst" xmlns:r="http://schemas.openxmlformats.org/officeDocument/2006/relationships" xmlns:m="http://schemas.openxmlformats.org/officeDocument/2006/math" xmlns:v="urn:schemas-microsoft-com:vml" xmlns:wp14="http://schemas.microsoft.com/office/word/2010/wordprocessingDrawing" xmlns:wp="http://schemas.openxmlformats.org/drawingml/2006/wordprocessingDrawing" xmlns:w10="urn:schemas-microsoft-com:office:word" xmlns:w="http://schemas.openxmlformats.org/wordprocessingml/2006/main" xmlns:w14="http://schemas.microsoft.com/office/word/2010/wordml" xmlns:w15="http://schemas.microsoft.com/office/word/2012/wordml" xmlns:w16cei="http://schemas.microsoft.com/office/word/2026/wordml/cei" xmlns:w16cex="http://schemas.microsoft.com/office/word/2018/wordml/cex" xmlns:w16cid="http://schemas.microsoft.com/office/word/2016/wordml/cid" xmlns:w16="http://schemas.microsoft.com/office/word/2018/wordml" xmlns:w16du="http://schemas.microsoft.com/office/word/2023/wordml/word16du" xmlns:w16sdtdh="http://schemas.microsoft.com/office/word/2020/wordml/sdtdatahash" xmlns:w16sdtfl="http://schemas.microsoft.com/office/word/2024/wordml/sdtformatlock" xmlns:w16se="http://schemas.microsoft.com/office/word/2015/wordml/symex" xmlns:wpg="http://schemas.microsoft.com/office/word/2010/wordprocessingGroup" xmlns:wpi="http://schemas.microsoft.com/office/word/2010/wordprocessingInk" xmlns:wne="http://schemas.microsoft.com/office/word/2006/wordml" xmlns:wps="http://schemas.microsoft.com/office/word/2010/wordprocessingShape" mc:Ignorable="w14 w15 w16se w16cid w16 w16cex w16sdtdh w16sdtfl w16du wp14">
+<w:ftr xmlns:wpc="http://schemas.microsoft.com/office/word/2010/wordprocessingCanvas" xmlns:cx="http://schemas.microsoft.com/office/drawing/2014/chartex" xmlns:mc="http://schemas.openxmlformats.org/markup-compatibility/2006" xmlns:o="urn:schemas-microsoft-com:office:office" xmlns:r="http://schemas.openxmlformats.org/officeDocument/2006/relationships" xmlns:m="http://schemas.openxmlformats.org/officeDocument/2006/math" xmlns:v="urn:schemas-microsoft-com:vml" xmlns:wp14="http://schemas.microsoft.com/office/word/2010/wordprocessingDrawing" xmlns:wp="http://schemas.openxmlformats.org/drawingml/2006/wordprocessingDrawing" xmlns:w10="urn:schemas-microsoft-com:office:word" xmlns:w="http://schemas.openxmlformats.org/wordprocessingml/2006/main" xmlns:w14="http://schemas.microsoft.com/office/word/2010/wordml" xmlns:w15="http://schemas.microsoft.com/office/word/2012/wordml" xmlns:w16se="http://schemas.microsoft.com/office/word/2015/wordml/symex" xmlns:wpg="http://schemas.microsoft.com/office/word/2010/wordprocessingGroup" xmlns:wpi="http://schemas.microsoft.com/office/word/2010/wordprocessingInk" xmlns:wne="http://schemas.microsoft.com/office/word/2006/wordml" xmlns:wps="http://schemas.microsoft.com/office/word/2010/wordprocessingShape" mc:Ignorable="w14 w15 w16se wp14">
   <w:sdt>
     <w:sdtPr>
       <w:id w:val="842437345"/>
@@ -16607,7 +17999,7 @@
           <w:rPr>
             <w:noProof/>
           </w:rPr>
-          <w:t>2</w:t>
+          <w:t>8</w:t>
         </w:r>
         <w:r>
           <w:rPr>
@@ -16627,7 +18019,7 @@
 </file>
 
 <file path=word/footnotes.xml><?xml version="1.0" encoding="utf-8"?>
-<w:footnotes xmlns:wpc="http://schemas.microsoft.com/office/word/2010/wordprocessingCanvas" xmlns:cx="http://schemas.microsoft.com/office/drawing/2014/chartex" xmlns:cx1="http://schemas.microsoft.com/office/drawing/2015/9/8/chartex" xmlns:cx2="http://schemas.microsoft.com/office/drawing/2015/10/21/chartex" xmlns:cx3="http://schemas.microsoft.com/office/drawing/2016/5/9/chartex" xmlns:cx4="http://schemas.microsoft.com/office/drawing/2016/5/10/chartex" xmlns:cx5="http://schemas.microsoft.com/office/drawing/2016/5/11/chartex" xmlns:cx6="http://schemas.microsoft.com/office/drawing/2016/5/12/chartex" xmlns:cx7="http://schemas.microsoft.com/office/drawing/2016/5/13/chartex" xmlns:cx8="http://schemas.microsoft.com/office/drawing/2016/5/14/chartex" xmlns:mc="http://schemas.openxmlformats.org/markup-compatibility/2006" xmlns:aink="http://schemas.microsoft.com/office/drawing/2016/ink" xmlns:am3d="http://schemas.microsoft.com/office/drawing/2017/model3d" xmlns:o="urn:schemas-microsoft-com:office:office" xmlns:oel="http://schemas.microsoft.com/office/2019/extlst" xmlns:r="http://schemas.openxmlformats.org/officeDocument/2006/relationships" xmlns:m="http://schemas.openxmlformats.org/officeDocument/2006/math" xmlns:v="urn:schemas-microsoft-com:vml" xmlns:wp14="http://schemas.microsoft.com/office/word/2010/wordprocessingDrawing" xmlns:wp="http://schemas.openxmlformats.org/drawingml/2006/wordprocessingDrawing" xmlns:w10="urn:schemas-microsoft-com:office:word" xmlns:w="http://schemas.openxmlformats.org/wordprocessingml/2006/main" xmlns:w14="http://schemas.microsoft.com/office/word/2010/wordml" xmlns:w15="http://schemas.microsoft.com/office/word/2012/wordml" xmlns:w16cei="http://schemas.microsoft.com/office/word/2026/wordml/cei" xmlns:w16cex="http://schemas.microsoft.com/office/word/2018/wordml/cex" xmlns:w16cid="http://schemas.microsoft.com/office/word/2016/wordml/cid" xmlns:w16="http://schemas.microsoft.com/office/word/2018/wordml" xmlns:w16du="http://schemas.microsoft.com/office/word/2023/wordml/word16du" xmlns:w16sdtdh="http://schemas.microsoft.com/office/word/2020/wordml/sdtdatahash" xmlns:w16sdtfl="http://schemas.microsoft.com/office/word/2024/wordml/sdtformatlock" xmlns:w16se="http://schemas.microsoft.com/office/word/2015/wordml/symex" xmlns:wpg="http://schemas.microsoft.com/office/word/2010/wordprocessingGroup" xmlns:wpi="http://schemas.microsoft.com/office/word/2010/wordprocessingInk" xmlns:wne="http://schemas.microsoft.com/office/word/2006/wordml" xmlns:wps="http://schemas.microsoft.com/office/word/2010/wordprocessingShape" mc:Ignorable="w14 w15 w16se w16cid w16 w16cex w16sdtdh w16sdtfl w16du wp14">
+<w:footnotes xmlns:wpc="http://schemas.microsoft.com/office/word/2010/wordprocessingCanvas" xmlns:cx="http://schemas.microsoft.com/office/drawing/2014/chartex" xmlns:mc="http://schemas.openxmlformats.org/markup-compatibility/2006" xmlns:o="urn:schemas-microsoft-com:office:office" xmlns:r="http://schemas.openxmlformats.org/officeDocument/2006/relationships" xmlns:m="http://schemas.openxmlformats.org/officeDocument/2006/math" xmlns:v="urn:schemas-microsoft-com:vml" xmlns:wp14="http://schemas.microsoft.com/office/word/2010/wordprocessingDrawing" xmlns:wp="http://schemas.openxmlformats.org/drawingml/2006/wordprocessingDrawing" xmlns:w10="urn:schemas-microsoft-com:office:word" xmlns:w="http://schemas.openxmlformats.org/wordprocessingml/2006/main" xmlns:w14="http://schemas.microsoft.com/office/word/2010/wordml" xmlns:w15="http://schemas.microsoft.com/office/word/2012/wordml" xmlns:w16se="http://schemas.microsoft.com/office/word/2015/wordml/symex" xmlns:wpg="http://schemas.microsoft.com/office/word/2010/wordprocessingGroup" xmlns:wpi="http://schemas.microsoft.com/office/word/2010/wordprocessingInk" xmlns:wne="http://schemas.microsoft.com/office/word/2006/wordml" xmlns:wps="http://schemas.microsoft.com/office/word/2010/wordprocessingShape" mc:Ignorable="w14 w15 w16se wp14">
   <w:footnote w:type="separator" w:id="-1">
     <w:p>
       <w:pPr>
@@ -16652,7 +18044,7 @@
 </file>
 
 <file path=word/header1.xml><?xml version="1.0" encoding="utf-8"?>
-<w:hdr xmlns:wpc="http://schemas.microsoft.com/office/word/2010/wordprocessingCanvas" xmlns:cx="http://schemas.microsoft.com/office/drawing/2014/chartex" xmlns:cx1="http://schemas.microsoft.com/office/drawing/2015/9/8/chartex" xmlns:cx2="http://schemas.microsoft.com/office/drawing/2015/10/21/chartex" xmlns:cx3="http://schemas.microsoft.com/office/drawing/2016/5/9/chartex" xmlns:cx4="http://schemas.microsoft.com/office/drawing/2016/5/10/chartex" xmlns:cx5="http://schemas.microsoft.com/office/drawing/2016/5/11/chartex" xmlns:cx6="http://schemas.microsoft.com/office/drawing/2016/5/12/chartex" xmlns:cx7="http://schemas.microsoft.com/office/drawing/2016/5/13/chartex" xmlns:cx8="http://schemas.microsoft.com/office/drawing/2016/5/14/chartex" xmlns:mc="http://schemas.openxmlformats.org/markup-compatibility/2006" xmlns:aink="http://schemas.microsoft.com/office/drawing/2016/ink" xmlns:am3d="http://schemas.microsoft.com/office/drawing/2017/model3d" xmlns:o="urn:schemas-microsoft-com:office:office" xmlns:oel="http://schemas.microsoft.com/office/2019/extlst" xmlns:r="http://schemas.openxmlformats.org/officeDocument/2006/relationships" xmlns:m="http://schemas.openxmlformats.org/officeDocument/2006/math" xmlns:v="urn:schemas-microsoft-com:vml" xmlns:wp14="http://schemas.microsoft.com/office/word/2010/wordprocessingDrawing" xmlns:wp="http://schemas.openxmlformats.org/drawingml/2006/wordprocessingDrawing" xmlns:w10="urn:schemas-microsoft-com:office:word" xmlns:w="http://schemas.openxmlformats.org/wordprocessingml/2006/main" xmlns:w14="http://schemas.microsoft.com/office/word/2010/wordml" xmlns:w15="http://schemas.microsoft.com/office/word/2012/wordml" xmlns:w16cei="http://schemas.microsoft.com/office/word/2026/wordml/cei" xmlns:w16cex="http://schemas.microsoft.com/office/word/2018/wordml/cex" xmlns:w16cid="http://schemas.microsoft.com/office/word/2016/wordml/cid" xmlns:w16="http://schemas.microsoft.com/office/word/2018/wordml" xmlns:w16du="http://schemas.microsoft.com/office/word/2023/wordml/word16du" xmlns:w16sdtdh="http://schemas.microsoft.com/office/word/2020/wordml/sdtdatahash" xmlns:w16sdtfl="http://schemas.microsoft.com/office/word/2024/wordml/sdtformatlock" xmlns:w16se="http://schemas.microsoft.com/office/word/2015/wordml/symex" xmlns:wpg="http://schemas.microsoft.com/office/word/2010/wordprocessingGroup" xmlns:wpi="http://schemas.microsoft.com/office/word/2010/wordprocessingInk" xmlns:wne="http://schemas.microsoft.com/office/word/2006/wordml" xmlns:wps="http://schemas.microsoft.com/office/word/2010/wordprocessingShape" mc:Ignorable="w14 w15 w16se w16cid w16 w16cex w16sdtdh w16sdtfl w16du wp14">
+<w:hdr xmlns:wpc="http://schemas.microsoft.com/office/word/2010/wordprocessingCanvas" xmlns:cx="http://schemas.microsoft.com/office/drawing/2014/chartex" xmlns:mc="http://schemas.openxmlformats.org/markup-compatibility/2006" xmlns:o="urn:schemas-microsoft-com:office:office" xmlns:r="http://schemas.openxmlformats.org/officeDocument/2006/relationships" xmlns:m="http://schemas.openxmlformats.org/officeDocument/2006/math" xmlns:v="urn:schemas-microsoft-com:vml" xmlns:wp14="http://schemas.microsoft.com/office/word/2010/wordprocessingDrawing" xmlns:wp="http://schemas.openxmlformats.org/drawingml/2006/wordprocessingDrawing" xmlns:w10="urn:schemas-microsoft-com:office:word" xmlns:w="http://schemas.openxmlformats.org/wordprocessingml/2006/main" xmlns:w14="http://schemas.microsoft.com/office/word/2010/wordml" xmlns:w15="http://schemas.microsoft.com/office/word/2012/wordml" xmlns:w16se="http://schemas.microsoft.com/office/word/2015/wordml/symex" xmlns:wpg="http://schemas.microsoft.com/office/word/2010/wordprocessingGroup" xmlns:wpi="http://schemas.microsoft.com/office/word/2010/wordprocessingInk" xmlns:wne="http://schemas.microsoft.com/office/word/2006/wordml" xmlns:wps="http://schemas.microsoft.com/office/word/2010/wordprocessingShape" mc:Ignorable="w14 w15 w16se wp14">
   <w:tbl>
     <w:tblPr>
       <w:tblStyle w:val="TableGrid"/>
@@ -16739,7 +18131,7 @@
 </file>
 
 <file path=word/numbering.xml><?xml version="1.0" encoding="utf-8"?>
-<w:numbering xmlns:wpc="http://schemas.microsoft.com/office/word/2010/wordprocessingCanvas" xmlns:cx="http://schemas.microsoft.com/office/drawing/2014/chartex" xmlns:cx1="http://schemas.microsoft.com/office/drawing/2015/9/8/chartex" xmlns:cx2="http://schemas.microsoft.com/office/drawing/2015/10/21/chartex" xmlns:cx3="http://schemas.microsoft.com/office/drawing/2016/5/9/chartex" xmlns:cx4="http://schemas.microsoft.com/office/drawing/2016/5/10/chartex" xmlns:cx5="http://schemas.microsoft.com/office/drawing/2016/5/11/chartex" xmlns:cx6="http://schemas.microsoft.com/office/drawing/2016/5/12/chartex" xmlns:cx7="http://schemas.microsoft.com/office/drawing/2016/5/13/chartex" xmlns:cx8="http://schemas.microsoft.com/office/drawing/2016/5/14/chartex" xmlns:mc="http://schemas.openxmlformats.org/markup-compatibility/2006" xmlns:aink="http://schemas.microsoft.com/office/drawing/2016/ink" xmlns:am3d="http://schemas.microsoft.com/office/drawing/2017/model3d" xmlns:o="urn:schemas-microsoft-com:office:office" xmlns:oel="http://schemas.microsoft.com/office/2019/extlst" xmlns:r="http://schemas.openxmlformats.org/officeDocument/2006/relationships" xmlns:m="http://schemas.openxmlformats.org/officeDocument/2006/math" xmlns:v="urn:schemas-microsoft-com:vml" xmlns:wp14="http://schemas.microsoft.com/office/word/2010/wordprocessingDrawing" xmlns:wp="http://schemas.openxmlformats.org/drawingml/2006/wordprocessingDrawing" xmlns:w10="urn:schemas-microsoft-com:office:word" xmlns:w="http://schemas.openxmlformats.org/wordprocessingml/2006/main" xmlns:w14="http://schemas.microsoft.com/office/word/2010/wordml" xmlns:w15="http://schemas.microsoft.com/office/word/2012/wordml" xmlns:w16cei="http://schemas.microsoft.com/office/word/2026/wordml/cei" xmlns:w16cex="http://schemas.microsoft.com/office/word/2018/wordml/cex" xmlns:w16cid="http://schemas.microsoft.com/office/word/2016/wordml/cid" xmlns:w16="http://schemas.microsoft.com/office/word/2018/wordml" xmlns:w16du="http://schemas.microsoft.com/office/word/2023/wordml/word16du" xmlns:w16sdtdh="http://schemas.microsoft.com/office/word/2020/wordml/sdtdatahash" xmlns:w16sdtfl="http://schemas.microsoft.com/office/word/2024/wordml/sdtformatlock" xmlns:w16se="http://schemas.microsoft.com/office/word/2015/wordml/symex" xmlns:wpg="http://schemas.microsoft.com/office/word/2010/wordprocessingGroup" xmlns:wpi="http://schemas.microsoft.com/office/word/2010/wordprocessingInk" xmlns:wne="http://schemas.microsoft.com/office/word/2006/wordml" xmlns:wps="http://schemas.microsoft.com/office/word/2010/wordprocessingShape" mc:Ignorable="w14 w15 w16se w16cid w16 w16cex w16sdtdh w16sdtfl w16du wp14">
+<w:numbering xmlns:wpc="http://schemas.microsoft.com/office/word/2010/wordprocessingCanvas" xmlns:cx="http://schemas.microsoft.com/office/drawing/2014/chartex" xmlns:mc="http://schemas.openxmlformats.org/markup-compatibility/2006" xmlns:o="urn:schemas-microsoft-com:office:office" xmlns:r="http://schemas.openxmlformats.org/officeDocument/2006/relationships" xmlns:m="http://schemas.openxmlformats.org/officeDocument/2006/math" xmlns:v="urn:schemas-microsoft-com:vml" xmlns:wp14="http://schemas.microsoft.com/office/word/2010/wordprocessingDrawing" xmlns:wp="http://schemas.openxmlformats.org/drawingml/2006/wordprocessingDrawing" xmlns:w10="urn:schemas-microsoft-com:office:word" xmlns:w="http://schemas.openxmlformats.org/wordprocessingml/2006/main" xmlns:w14="http://schemas.microsoft.com/office/word/2010/wordml" xmlns:w15="http://schemas.microsoft.com/office/word/2012/wordml" xmlns:w16se="http://schemas.microsoft.com/office/word/2015/wordml/symex" xmlns:wpg="http://schemas.microsoft.com/office/word/2010/wordprocessingGroup" xmlns:wpi="http://schemas.microsoft.com/office/word/2010/wordprocessingInk" xmlns:wne="http://schemas.microsoft.com/office/word/2006/wordml" xmlns:wps="http://schemas.microsoft.com/office/word/2010/wordprocessingShape" mc:Ignorable="w14 w15 w16se wp14">
   <w:abstractNum w:abstractNumId="0" w15:restartNumberingAfterBreak="0">
     <w:nsid w:val="01107F94"/>
     <w:multiLevelType w:val="multilevel"/>
@@ -20152,92 +21544,92 @@
       </w:rPr>
     </w:lvl>
   </w:abstractNum>
-  <w:num w:numId="1" w16cid:durableId="125634987">
+  <w:num w:numId="1">
     <w:abstractNumId w:val="10"/>
   </w:num>
-  <w:num w:numId="2" w16cid:durableId="47917732">
+  <w:num w:numId="2">
     <w:abstractNumId w:val="3"/>
   </w:num>
-  <w:num w:numId="3" w16cid:durableId="1426609053">
+  <w:num w:numId="3">
     <w:abstractNumId w:val="8"/>
   </w:num>
-  <w:num w:numId="4" w16cid:durableId="1701853510">
+  <w:num w:numId="4">
     <w:abstractNumId w:val="22"/>
   </w:num>
-  <w:num w:numId="5" w16cid:durableId="1599749160">
+  <w:num w:numId="5">
     <w:abstractNumId w:val="19"/>
   </w:num>
-  <w:num w:numId="6" w16cid:durableId="1194920103">
+  <w:num w:numId="6">
     <w:abstractNumId w:val="6"/>
   </w:num>
-  <w:num w:numId="7" w16cid:durableId="197933069">
+  <w:num w:numId="7">
     <w:abstractNumId w:val="18"/>
   </w:num>
-  <w:num w:numId="8" w16cid:durableId="2059039092">
+  <w:num w:numId="8">
     <w:abstractNumId w:val="25"/>
   </w:num>
-  <w:num w:numId="9" w16cid:durableId="581454708">
+  <w:num w:numId="9">
     <w:abstractNumId w:val="11"/>
   </w:num>
-  <w:num w:numId="10" w16cid:durableId="1356075877">
+  <w:num w:numId="10">
     <w:abstractNumId w:val="21"/>
   </w:num>
-  <w:num w:numId="11" w16cid:durableId="913317586">
+  <w:num w:numId="11">
     <w:abstractNumId w:val="15"/>
   </w:num>
-  <w:num w:numId="12" w16cid:durableId="317536213">
+  <w:num w:numId="12">
     <w:abstractNumId w:val="7"/>
   </w:num>
-  <w:num w:numId="13" w16cid:durableId="6837406">
+  <w:num w:numId="13">
     <w:abstractNumId w:val="20"/>
   </w:num>
-  <w:num w:numId="14" w16cid:durableId="1756704913">
+  <w:num w:numId="14">
     <w:abstractNumId w:val="16"/>
   </w:num>
-  <w:num w:numId="15" w16cid:durableId="2095784365">
+  <w:num w:numId="15">
     <w:abstractNumId w:val="24"/>
   </w:num>
-  <w:num w:numId="16" w16cid:durableId="387998514">
+  <w:num w:numId="16">
     <w:abstractNumId w:val="5"/>
   </w:num>
-  <w:num w:numId="17" w16cid:durableId="548420926">
+  <w:num w:numId="17">
     <w:abstractNumId w:val="12"/>
   </w:num>
-  <w:num w:numId="18" w16cid:durableId="209270240">
+  <w:num w:numId="18">
     <w:abstractNumId w:val="16"/>
   </w:num>
-  <w:num w:numId="19" w16cid:durableId="1125192938">
+  <w:num w:numId="19">
     <w:abstractNumId w:val="1"/>
   </w:num>
-  <w:num w:numId="20" w16cid:durableId="1323120533">
+  <w:num w:numId="20">
     <w:abstractNumId w:val="0"/>
   </w:num>
-  <w:num w:numId="21" w16cid:durableId="2025402832">
+  <w:num w:numId="21">
     <w:abstractNumId w:val="23"/>
   </w:num>
-  <w:num w:numId="22" w16cid:durableId="2062558986">
+  <w:num w:numId="22">
     <w:abstractNumId w:val="17"/>
   </w:num>
-  <w:num w:numId="23" w16cid:durableId="1664579420">
+  <w:num w:numId="23">
     <w:abstractNumId w:val="2"/>
   </w:num>
-  <w:num w:numId="24" w16cid:durableId="952828088">
+  <w:num w:numId="24">
     <w:abstractNumId w:val="14"/>
   </w:num>
-  <w:num w:numId="25" w16cid:durableId="1150907763">
+  <w:num w:numId="25">
     <w:abstractNumId w:val="4"/>
   </w:num>
-  <w:num w:numId="26" w16cid:durableId="1795371500">
+  <w:num w:numId="26">
     <w:abstractNumId w:val="9"/>
   </w:num>
-  <w:num w:numId="27" w16cid:durableId="380713764">
+  <w:num w:numId="27">
     <w:abstractNumId w:val="13"/>
   </w:num>
 </w:numbering>
 </file>
 
 <file path=word/styles.xml><?xml version="1.0" encoding="utf-8"?>
-<w:styles xmlns:mc="http://schemas.openxmlformats.org/markup-compatibility/2006" xmlns:r="http://schemas.openxmlformats.org/officeDocument/2006/relationships" xmlns:w="http://schemas.openxmlformats.org/wordprocessingml/2006/main" xmlns:w14="http://schemas.microsoft.com/office/word/2010/wordml" xmlns:w15="http://schemas.microsoft.com/office/word/2012/wordml" xmlns:w16cex="http://schemas.microsoft.com/office/word/2018/wordml/cex" xmlns:w16cid="http://schemas.microsoft.com/office/word/2016/wordml/cid" xmlns:w16="http://schemas.microsoft.com/office/word/2018/wordml" xmlns:w16du="http://schemas.microsoft.com/office/word/2023/wordml/word16du" xmlns:w16sdtdh="http://schemas.microsoft.com/office/word/2020/wordml/sdtdatahash" xmlns:w16sdtfl="http://schemas.microsoft.com/office/word/2024/wordml/sdtformatlock" xmlns:w16se="http://schemas.microsoft.com/office/word/2015/wordml/symex" mc:Ignorable="w14 w15 w16se w16cid w16 w16cex w16sdtdh w16sdtfl w16du">
+<w:styles xmlns:mc="http://schemas.openxmlformats.org/markup-compatibility/2006" xmlns:r="http://schemas.openxmlformats.org/officeDocument/2006/relationships" xmlns:w="http://schemas.openxmlformats.org/wordprocessingml/2006/main" xmlns:w14="http://schemas.microsoft.com/office/word/2010/wordml" xmlns:w15="http://schemas.microsoft.com/office/word/2012/wordml" xmlns:w16se="http://schemas.microsoft.com/office/word/2015/wordml/symex" mc:Ignorable="w14 w15 w16se">
   <w:docDefaults>
     <w:rPrDefault>
       <w:rPr>
@@ -20255,7 +21647,7 @@
       </w:pPr>
     </w:pPrDefault>
   </w:docDefaults>
-  <w:latentStyles w:defLockedState="0" w:defUIPriority="99" w:defSemiHidden="0" w:defUnhideWhenUsed="0" w:defQFormat="0" w:count="376">
+  <w:latentStyles w:defLockedState="0" w:defUIPriority="99" w:defSemiHidden="0" w:defUnhideWhenUsed="0" w:defQFormat="0" w:count="371">
     <w:lsdException w:name="Normal" w:uiPriority="0" w:qFormat="1"/>
     <w:lsdException w:name="heading 1" w:uiPriority="9" w:qFormat="1"/>
     <w:lsdException w:name="heading 2" w:semiHidden="1" w:uiPriority="9" w:unhideWhenUsed="1" w:qFormat="1"/>
@@ -20627,11 +22019,6 @@
     <w:lsdException w:name="List Table 5 Dark Accent 6" w:uiPriority="50"/>
     <w:lsdException w:name="List Table 6 Colorful Accent 6" w:uiPriority="51"/>
     <w:lsdException w:name="List Table 7 Colorful Accent 6" w:uiPriority="52"/>
-    <w:lsdException w:name="Mention" w:semiHidden="1" w:unhideWhenUsed="1"/>
-    <w:lsdException w:name="Smart Hyperlink" w:semiHidden="1" w:unhideWhenUsed="1"/>
-    <w:lsdException w:name="Hashtag" w:semiHidden="1" w:unhideWhenUsed="1"/>
-    <w:lsdException w:name="Unresolved Mention" w:semiHidden="1" w:unhideWhenUsed="1"/>
-    <w:lsdException w:name="Smart Link" w:semiHidden="1" w:unhideWhenUsed="1"/>
   </w:latentStyles>
   <w:style w:type="paragraph" w:default="1" w:styleId="Normal">
     <w:name w:val="Normal"/>

</xml_diff>